<commit_message>
Extend onboarding to two weeks with page breaks and professional tone.
Adds Week 2 development plan, section dividers, WEEK2_LOG template, and replaces informal completion language.

Co-authored-by: Cursor <cursoragent@cursor.com>
</commit_message>
<xml_diff>
--- a/cursor/onboarding/AXIOM_EMPLOYEE_ONBOARDING.docx
+++ b/cursor/onboarding/AXIOM_EMPLOYEE_ONBOARDING.docx
@@ -36,7 +36,7 @@
                 <w:color w:val="F0F0F0"/>
                 <w:sz w:val="44"/>
               </w:rPr>
-              <w:t>Your First Week — Step by Step</w:t>
+              <w:t>Two-Week Onboarding Program</w:t>
               <w:br/>
             </w:r>
             <w:r>
@@ -47,7 +47,7 @@
                 <w:color w:val="C4C4C4"/>
                 <w:sz w:val="22"/>
               </w:rPr>
-              <w:t>No experience needed. Follow each step in order.</w:t>
+              <w:t>Week 1: Foundations  |  Week 2: Applied Development</w:t>
             </w:r>
           </w:p>
         </w:tc>
@@ -70,7 +70,7 @@
           <w:color w:val="222222"/>
           <w:sz w:val="22"/>
         </w:rPr>
-        <w:t>Welcome. This guide assumes you have never used GitHub, the terminal, or coding tools before. That is OK. Every step tells you exactly what to click, what to copy, and what you should see on screen.</w:t>
+        <w:t>This guide assumes no prior experience with GitHub, the terminal, or development tools. Follow each part in order. Each step states what to click, what to copy, and what you should see on screen.</w:t>
       </w:r>
     </w:p>
     <w:tbl>
@@ -105,7 +105,7 @@
                 <w:color w:val="4A9EFF"/>
                 <w:sz w:val="17"/>
               </w:rPr>
-              <w:t xml:space="preserve">HOW LONG  </w:t>
+              <w:t xml:space="preserve">SCHEDULE  </w:t>
             </w:r>
             <w:r>
               <w:rPr>
@@ -115,7 +115,7 @@
                 <w:color w:val="222222"/>
                 <w:sz w:val="21"/>
               </w:rPr>
-              <w:t>Day 0 (when your laptop arrives): 2 to 3 hours to install everything. Monday to Friday: about 1 hour per day for lessons and practice.</w:t>
+              <w:t>Day 0 (laptop setup): 2 to 3 hours. Weeks 1 and 2: about 1 hour per day, Monday through Friday. Session recordings are required during Week 1 only unless management requests otherwise.</w:t>
             </w:r>
           </w:p>
         </w:tc>
@@ -128,6 +128,14 @@
     </w:p>
     <w:p>
       <w:pPr>
+        <w:spacing w:before="0" w:after="0"/>
+      </w:pPr>
+      <w:r>
+        <w:br w:type="page"/>
+      </w:r>
+    </w:p>
+    <w:p>
+      <w:pPr>
         <w:spacing w:after="160"/>
       </w:pPr>
     </w:p>
@@ -178,7 +186,7 @@
           <w:color w:val="555555"/>
           <w:sz w:val="22"/>
         </w:rPr>
-        <w:t>Five things to understand before Day 0.</w:t>
+        <w:t>Required reading before Day 0.</w:t>
       </w:r>
     </w:p>
     <w:p>
@@ -448,7 +456,7 @@
           <w:color w:val="222222"/>
           <w:sz w:val="21"/>
         </w:rPr>
-        <w:t>The command runs. New text appears. If you see red error text, read the step again or see Part 8 (Help).</w:t>
+        <w:t>The command runs. New text appears. If you see red error text, read the step again or see Part 10 (Support).</w:t>
       </w:r>
     </w:p>
     <w:tbl>
@@ -604,7 +612,7 @@
           <w:color w:val="222222"/>
           <w:sz w:val="22"/>
         </w:rPr>
-        <w:t>Day 0 — Install software on your laptop</w:t>
+        <w:t>Day 0 — Install software</w:t>
       </w:r>
     </w:p>
     <w:p>
@@ -629,7 +637,7 @@
           <w:color w:val="222222"/>
           <w:sz w:val="22"/>
         </w:rPr>
-        <w:t>Day 0 — Create your online accounts</w:t>
+        <w:t>Day 0 — Create accounts</w:t>
       </w:r>
     </w:p>
     <w:p>
@@ -654,7 +662,7 @@
           <w:color w:val="222222"/>
           <w:sz w:val="22"/>
         </w:rPr>
-        <w:t>Simple words — what is GitHub?</w:t>
+        <w:t>GitHub — concepts and setup</w:t>
       </w:r>
     </w:p>
     <w:p>
@@ -679,7 +687,7 @@
           <w:color w:val="222222"/>
           <w:sz w:val="22"/>
         </w:rPr>
-        <w:t>Monday — Download the project and your first push</w:t>
+        <w:t>Week 1, Monday — Download the project</w:t>
       </w:r>
     </w:p>
     <w:p>
@@ -704,7 +712,7 @@
           <w:color w:val="222222"/>
           <w:sz w:val="22"/>
         </w:rPr>
-        <w:t>Tuesday to Friday — one section per day</w:t>
+        <w:t>Week 1, Tuesday–Friday — Daily plan</w:t>
       </w:r>
     </w:p>
     <w:p>
@@ -729,7 +737,7 @@
           <w:color w:val="222222"/>
           <w:sz w:val="22"/>
         </w:rPr>
-        <w:t>How to record your screen (trust sessions)</w:t>
+        <w:t>Week 1 — Session recordings</w:t>
       </w:r>
     </w:p>
     <w:p>
@@ -754,7 +762,7 @@
           <w:color w:val="222222"/>
           <w:sz w:val="22"/>
         </w:rPr>
-        <w:t>Cursor — what to paste at start and end of work</w:t>
+        <w:t>Cursor — session commands</w:t>
       </w:r>
     </w:p>
     <w:p>
@@ -779,7 +787,7 @@
           <w:color w:val="222222"/>
           <w:sz w:val="22"/>
         </w:rPr>
-        <w:t>When something goes wrong</w:t>
+        <w:t>Week 2, Monday–Friday — Development plan</w:t>
       </w:r>
     </w:p>
     <w:p>
@@ -804,7 +812,7 @@
           <w:color w:val="222222"/>
           <w:sz w:val="22"/>
         </w:rPr>
-        <w:t>Free learning links</w:t>
+        <w:t>Learning resources</w:t>
       </w:r>
     </w:p>
     <w:p>
@@ -829,17 +837,12 @@
           <w:color w:val="222222"/>
           <w:sz w:val="22"/>
         </w:rPr>
-        <w:t>Week 1 complete — graduation checklist</w:t>
-      </w:r>
-    </w:p>
-    <w:p>
-      <w:pPr>
-        <w:spacing w:after="160"/>
-      </w:pPr>
-    </w:p>
-    <w:p>
-      <w:pPr>
-        <w:spacing w:before="120" w:after="80"/>
+        <w:t>Support and troubleshooting</w:t>
+      </w:r>
+    </w:p>
+    <w:p>
+      <w:pPr>
+        <w:spacing w:after="100"/>
       </w:pPr>
       <w:r>
         <w:rPr>
@@ -849,6 +852,105 @@
           <w:color w:val="4A9EFF"/>
           <w:sz w:val="20"/>
         </w:rPr>
+        <w:t xml:space="preserve">Part 11  </w:t>
+      </w:r>
+      <w:r>
+        <w:rPr>
+          <w:rFonts w:ascii="Calibri" w:hAnsi="Calibri"/>
+          <w:b w:val="0"/>
+          <w:i w:val="0"/>
+          <w:color w:val="222222"/>
+          <w:sz w:val="22"/>
+        </w:rPr>
+        <w:t>Onboarding completion criteria</w:t>
+      </w:r>
+    </w:p>
+    <w:p>
+      <w:pPr>
+        <w:spacing w:before="0" w:after="0"/>
+      </w:pPr>
+      <w:r>
+        <w:br w:type="page"/>
+      </w:r>
+    </w:p>
+    <w:tbl>
+      <w:tblPr>
+        <w:tblW w:type="auto" w:w="0"/>
+        <w:tblLayout w:type="fixed"/>
+        <w:tblLook w:firstColumn="1" w:firstRow="1" w:lastColumn="0" w:lastRow="0" w:noHBand="0" w:noVBand="1" w:val="04A0"/>
+      </w:tblPr>
+      <w:tblGrid>
+        <w:gridCol w:w="9360"/>
+      </w:tblGrid>
+      <w:tr>
+        <w:tc>
+          <w:tcPr>
+            <w:tcW w:type="dxa" w:w="9360"/>
+            <w:shd w:fill="080808" w:val="clear"/>
+            <w:tcBorders>
+              <w:top w:val="single" w:sz="12" w:color="1A1A1A"/>
+              <w:left w:val="single" w:sz="12" w:color="1A1A1A"/>
+              <w:bottom w:val="single" w:sz="12" w:color="1A1A1A"/>
+              <w:right w:val="single" w:sz="12" w:color="1A1A1A"/>
+            </w:tcBorders>
+          </w:tcPr>
+          <w:p>
+            <w:pPr>
+              <w:spacing w:before="280" w:after="120"/>
+              <w:jc w:val="center"/>
+            </w:pPr>
+            <w:r>
+              <w:rPr>
+                <w:rFonts w:ascii="Consolas" w:hAnsi="Consolas"/>
+                <w:b/>
+                <w:i w:val="0"/>
+                <w:color w:val="F0F0F0"/>
+                <w:sz w:val="24"/>
+              </w:rPr>
+              <w:t>WEEK 1 — FOUNDATIONS</w:t>
+            </w:r>
+          </w:p>
+          <w:p>
+            <w:pPr>
+              <w:spacing w:after="240"/>
+              <w:jc w:val="center"/>
+            </w:pPr>
+            <w:r>
+              <w:rPr>
+                <w:rFonts w:ascii="Calibri" w:hAnsi="Calibri"/>
+                <w:b w:val="0"/>
+                <w:i w:val="0"/>
+                <w:color w:val="C4C4C4"/>
+                <w:sz w:val="21"/>
+              </w:rPr>
+              <w:t>Setup, GitHub, automation, AI concepts, first run of UStud</w:t>
+            </w:r>
+          </w:p>
+        </w:tc>
+      </w:tr>
+    </w:tbl>
+    <w:p>
+      <w:pPr>
+        <w:spacing w:after="360"/>
+      </w:pPr>
+    </w:p>
+    <w:p>
+      <w:pPr>
+        <w:spacing w:after="160"/>
+      </w:pPr>
+    </w:p>
+    <w:p>
+      <w:pPr>
+        <w:spacing w:before="120" w:after="80"/>
+      </w:pPr>
+      <w:r>
+        <w:rPr>
+          <w:rFonts w:ascii="Consolas" w:hAnsi="Consolas"/>
+          <w:b/>
+          <w:i w:val="0"/>
+          <w:color w:val="4A9EFF"/>
+          <w:sz w:val="20"/>
+        </w:rPr>
         <w:t>PART 1</w:t>
       </w:r>
     </w:p>
@@ -884,7 +986,7 @@
           <w:color w:val="555555"/>
           <w:sz w:val="22"/>
         </w:rPr>
-        <w:t>Do this when your laptop arrives, before Monday. Your laptop must be Windows 10 or 11.</w:t>
+        <w:t>Complete when your laptop arrives, before Week 1 Monday. Windows 10 or 11 required.</w:t>
       </w:r>
     </w:p>
     <w:tbl>
@@ -1955,7 +2057,7 @@
           <w:color w:val="222222"/>
           <w:sz w:val="22"/>
         </w:rPr>
-        <w:t>OBS records your screen and webcam during Week 1.</w:t>
+        <w:t>OBS records your screen and webcam during Week 1 sessions.</w:t>
       </w:r>
     </w:p>
     <w:p>
@@ -2034,6 +2136,14 @@
     </w:p>
     <w:p>
       <w:pPr>
+        <w:spacing w:before="0" w:after="0"/>
+      </w:pPr>
+      <w:r>
+        <w:br w:type="page"/>
+      </w:r>
+    </w:p>
+    <w:p>
+      <w:pPr>
         <w:spacing w:after="160"/>
       </w:pPr>
     </w:p>
@@ -2369,6 +2479,14 @@
     </w:p>
     <w:p>
       <w:pPr>
+        <w:spacing w:before="0" w:after="0"/>
+      </w:pPr>
+      <w:r>
+        <w:br w:type="page"/>
+      </w:r>
+    </w:p>
+    <w:p>
+      <w:pPr>
         <w:spacing w:after="160"/>
       </w:pPr>
     </w:p>
@@ -2404,7 +2522,7 @@
           <w:color w:val="080808"/>
           <w:sz w:val="40"/>
         </w:rPr>
-        <w:t>Simple Words — What Is GitHub?</w:t>
+        <w:t>GitHub — Concepts and Setup</w:t>
       </w:r>
     </w:p>
     <w:p>
@@ -2419,7 +2537,7 @@
           <w:color w:val="555555"/>
           <w:sz w:val="22"/>
         </w:rPr>
-        <w:t>Read this on Monday before you download the project.</w:t>
+        <w:t>Read on Week 1 Monday before you download the project.</w:t>
       </w:r>
     </w:p>
     <w:p>
@@ -2733,6 +2851,14 @@
     </w:p>
     <w:p>
       <w:pPr>
+        <w:spacing w:before="0" w:after="0"/>
+      </w:pPr>
+      <w:r>
+        <w:br w:type="page"/>
+      </w:r>
+    </w:p>
+    <w:p>
+      <w:pPr>
         <w:spacing w:after="160"/>
       </w:pPr>
     </w:p>
@@ -2768,7 +2894,7 @@
           <w:color w:val="080808"/>
           <w:sz w:val="40"/>
         </w:rPr>
-        <w:t>Monday — Download the Project</w:t>
+        <w:t>Week 1, Monday — Download the Project</w:t>
       </w:r>
     </w:p>
     <w:p>
@@ -2783,7 +2909,7 @@
           <w:color w:val="555555"/>
           <w:sz w:val="22"/>
         </w:rPr>
-        <w:t>About 1 hour. Start OBS recording first (see Part 6).</w:t>
+        <w:t>About 1 hour. Start your session recording first (see Part 6).</w:t>
       </w:r>
     </w:p>
     <w:tbl>
@@ -3921,6 +4047,14 @@
     </w:p>
     <w:p>
       <w:pPr>
+        <w:spacing w:before="0" w:after="0"/>
+      </w:pPr>
+      <w:r>
+        <w:br w:type="page"/>
+      </w:r>
+    </w:p>
+    <w:p>
+      <w:pPr>
         <w:spacing w:after="160"/>
       </w:pPr>
     </w:p>
@@ -3956,7 +4090,7 @@
           <w:color w:val="080808"/>
           <w:sz w:val="40"/>
         </w:rPr>
-        <w:t>Tuesday to Friday — Daily Plan</w:t>
+        <w:t>Week 1, Tuesday–Friday — Daily Plan</w:t>
       </w:r>
     </w:p>
     <w:p>
@@ -3971,7 +4105,7 @@
           <w:color w:val="555555"/>
           <w:sz w:val="22"/>
         </w:rPr>
-        <w:t>Same order every day: OBS on, lesson, upload video, update log, git push.</w:t>
+        <w:t>Same order each day: start recording, complete the lesson, upload video, update log, push to GitHub.</w:t>
       </w:r>
     </w:p>
     <w:tbl>
@@ -4039,7 +4173,7 @@
           <w:color w:val="080808"/>
           <w:sz w:val="28"/>
         </w:rPr>
-        <w:t>Tuesday — Automation</w:t>
+        <w:t>Week 1, Tuesday — Automation</w:t>
       </w:r>
     </w:p>
     <w:p>
@@ -4350,6 +4484,14 @@
     </w:p>
     <w:p>
       <w:pPr>
+        <w:spacing w:before="0" w:after="0"/>
+      </w:pPr>
+      <w:r>
+        <w:br w:type="page"/>
+      </w:r>
+    </w:p>
+    <w:p>
+      <w:pPr>
         <w:spacing w:before="320" w:after="160"/>
       </w:pPr>
       <w:r>
@@ -4360,7 +4502,7 @@
           <w:color w:val="080808"/>
           <w:sz w:val="28"/>
         </w:rPr>
-        <w:t>Wednesday — AI and LLMs</w:t>
+        <w:t>Week 1, Wednesday — AI and LLMs</w:t>
       </w:r>
     </w:p>
     <w:p>
@@ -4548,6 +4690,14 @@
     </w:p>
     <w:p>
       <w:pPr>
+        <w:spacing w:before="0" w:after="0"/>
+      </w:pPr>
+      <w:r>
+        <w:br w:type="page"/>
+      </w:r>
+    </w:p>
+    <w:p>
+      <w:pPr>
         <w:spacing w:before="320" w:after="160"/>
       </w:pPr>
       <w:r>
@@ -4558,7 +4708,7 @@
           <w:color w:val="080808"/>
           <w:sz w:val="28"/>
         </w:rPr>
-        <w:t>Thursday — Agents and Cursor</w:t>
+        <w:t>Week 1, Thursday — Agents and Cursor</w:t>
       </w:r>
     </w:p>
     <w:p>
@@ -4808,6 +4958,14 @@
     </w:p>
     <w:p>
       <w:pPr>
+        <w:spacing w:before="0" w:after="0"/>
+      </w:pPr>
+      <w:r>
+        <w:br w:type="page"/>
+      </w:r>
+    </w:p>
+    <w:p>
+      <w:pPr>
         <w:spacing w:before="320" w:after="160"/>
       </w:pPr>
       <w:r>
@@ -4818,7 +4976,7 @@
           <w:color w:val="080808"/>
           <w:sz w:val="28"/>
         </w:rPr>
-        <w:t>Friday — Run the App</w:t>
+        <w:t>Week 1, Friday — Run the Application</w:t>
       </w:r>
     </w:p>
     <w:p>
@@ -4833,7 +4991,7 @@
           <w:color w:val="222222"/>
           <w:sz w:val="22"/>
         </w:rPr>
-        <w:t>Today you run UStud on your laptop and make one small improvement.</w:t>
+        <w:t>Run UStud on your laptop and deliver your first small improvement.</w:t>
       </w:r>
     </w:p>
     <w:p>
@@ -5626,6 +5784,67 @@
         <w:t>Session End from Part 7, then git add ., commit, push.</w:t>
       </w:r>
     </w:p>
+    <w:tbl>
+      <w:tblPr>
+        <w:tblW w:type="auto" w:w="0"/>
+        <w:tblLook w:firstColumn="1" w:firstRow="1" w:lastColumn="0" w:lastRow="0" w:noHBand="0" w:noVBand="1" w:val="04A0"/>
+      </w:tblPr>
+      <w:tblGrid>
+        <w:gridCol w:w="9360"/>
+      </w:tblGrid>
+      <w:tr>
+        <w:tc>
+          <w:tcPr>
+            <w:tcW w:type="dxa" w:w="9360"/>
+            <w:shd w:fill="E8F8EF" w:val="clear"/>
+            <w:tcBorders>
+              <w:top w:val="single" w:sz="4" w:color="CCCCCC"/>
+              <w:left w:val="single" w:sz="4" w:color="CCCCCC"/>
+              <w:bottom w:val="single" w:sz="4" w:color="CCCCCC"/>
+              <w:right w:val="single" w:sz="4" w:color="CCCCCC"/>
+            </w:tcBorders>
+          </w:tcPr>
+          <w:p>
+            <w:pPr>
+              <w:spacing w:before="160" w:after="160"/>
+            </w:pPr>
+            <w:r>
+              <w:rPr>
+                <w:rFonts w:ascii="Consolas" w:hAnsi="Consolas"/>
+                <w:b/>
+                <w:i w:val="0"/>
+                <w:color w:val="3DD68C"/>
+                <w:sz w:val="17"/>
+              </w:rPr>
+              <w:t xml:space="preserve">END OF WEEK 1  </w:t>
+            </w:r>
+            <w:r>
+              <w:rPr>
+                <w:rFonts w:ascii="Calibri" w:hAnsi="Calibri"/>
+                <w:b w:val="0"/>
+                <w:i w:val="0"/>
+                <w:color w:val="222222"/>
+                <w:sz w:val="21"/>
+              </w:rPr>
+              <w:t>Confirm: GitHub push works, session recordings uploaded Mon–Fri, UStud runs at http://localhost:5173, and progress/CURRENT_STATE.md lists three product gaps.</w:t>
+            </w:r>
+          </w:p>
+        </w:tc>
+      </w:tr>
+    </w:tbl>
+    <w:p>
+      <w:pPr>
+        <w:spacing w:after="160"/>
+      </w:pPr>
+    </w:p>
+    <w:p>
+      <w:pPr>
+        <w:spacing w:before="0" w:after="0"/>
+      </w:pPr>
+      <w:r>
+        <w:br w:type="page"/>
+      </w:r>
+    </w:p>
     <w:p>
       <w:pPr>
         <w:spacing w:after="160"/>
@@ -5663,7 +5882,7 @@
           <w:color w:val="080808"/>
           <w:sz w:val="40"/>
         </w:rPr>
-        <w:t>How to Record Your Screen (Trust Sessions)</w:t>
+        <w:t>Week 1 — Session Recordings</w:t>
       </w:r>
     </w:p>
     <w:p>
@@ -5678,7 +5897,7 @@
           <w:color w:val="555555"/>
           <w:sz w:val="22"/>
         </w:rPr>
-        <w:t>Monday through Friday, about 1 hour each day.</w:t>
+        <w:t>Required Monday through Friday during Week 1, about 1 hour per session.</w:t>
       </w:r>
     </w:p>
     <w:p>
@@ -6244,6 +6463,14 @@
     </w:p>
     <w:p>
       <w:pPr>
+        <w:spacing w:before="0" w:after="0"/>
+      </w:pPr>
+      <w:r>
+        <w:br w:type="page"/>
+      </w:r>
+    </w:p>
+    <w:p>
+      <w:pPr>
         <w:spacing w:after="160"/>
       </w:pPr>
     </w:p>
@@ -6279,7 +6506,7 @@
           <w:color w:val="080808"/>
           <w:sz w:val="40"/>
         </w:rPr>
-        <w:t>Cursor — Copy and Paste Blocks</w:t>
+        <w:t>Cursor — Session Commands</w:t>
       </w:r>
     </w:p>
     <w:p>
@@ -6294,7 +6521,7 @@
           <w:color w:val="555555"/>
           <w:sz w:val="22"/>
         </w:rPr>
-        <w:t>Use these every work session after Week 1 too.</w:t>
+        <w:t>Use at the start and end of every work session during Week 2 and ongoing development.</w:t>
       </w:r>
     </w:p>
     <w:p>
@@ -6485,6 +6712,75 @@
     </w:p>
     <w:p>
       <w:pPr>
+        <w:spacing w:before="0" w:after="0"/>
+      </w:pPr>
+      <w:r>
+        <w:br w:type="page"/>
+      </w:r>
+    </w:p>
+    <w:tbl>
+      <w:tblPr>
+        <w:tblW w:type="auto" w:w="0"/>
+        <w:tblLayout w:type="fixed"/>
+        <w:tblLook w:firstColumn="1" w:firstRow="1" w:lastColumn="0" w:lastRow="0" w:noHBand="0" w:noVBand="1" w:val="04A0"/>
+      </w:tblPr>
+      <w:tblGrid>
+        <w:gridCol w:w="9360"/>
+      </w:tblGrid>
+      <w:tr>
+        <w:tc>
+          <w:tcPr>
+            <w:tcW w:type="dxa" w:w="9360"/>
+            <w:shd w:fill="080808" w:val="clear"/>
+            <w:tcBorders>
+              <w:top w:val="single" w:sz="12" w:color="1A1A1A"/>
+              <w:left w:val="single" w:sz="12" w:color="1A1A1A"/>
+              <w:bottom w:val="single" w:sz="12" w:color="1A1A1A"/>
+              <w:right w:val="single" w:sz="12" w:color="1A1A1A"/>
+            </w:tcBorders>
+          </w:tcPr>
+          <w:p>
+            <w:pPr>
+              <w:spacing w:before="280" w:after="120"/>
+              <w:jc w:val="center"/>
+            </w:pPr>
+            <w:r>
+              <w:rPr>
+                <w:rFonts w:ascii="Consolas" w:hAnsi="Consolas"/>
+                <w:b/>
+                <w:i w:val="0"/>
+                <w:color w:val="F0F0F0"/>
+                <w:sz w:val="24"/>
+              </w:rPr>
+              <w:t>WEEK 2 — APPLIED DEVELOPMENT</w:t>
+            </w:r>
+          </w:p>
+          <w:p>
+            <w:pPr>
+              <w:spacing w:after="240"/>
+              <w:jc w:val="center"/>
+            </w:pPr>
+            <w:r>
+              <w:rPr>
+                <w:rFonts w:ascii="Calibri" w:hAnsi="Calibri"/>
+                <w:b w:val="0"/>
+                <w:i w:val="0"/>
+                <w:color w:val="C4C4C4"/>
+                <w:sz w:val="21"/>
+              </w:rPr>
+              <w:t>Build on UStud, deliver improvements, establish daily workflow</w:t>
+            </w:r>
+          </w:p>
+        </w:tc>
+      </w:tr>
+    </w:tbl>
+    <w:p>
+      <w:pPr>
+        <w:spacing w:after="360"/>
+      </w:pPr>
+    </w:p>
+    <w:p>
+      <w:pPr>
         <w:spacing w:after="160"/>
       </w:pPr>
     </w:p>
@@ -6520,7 +6816,7 @@
           <w:color w:val="080808"/>
           <w:sz w:val="40"/>
         </w:rPr>
-        <w:t>When Something Goes Wrong</w:t>
+        <w:t>Week 2, Monday–Friday — Development Plan</w:t>
       </w:r>
     </w:p>
     <w:p>
@@ -6535,7 +6831,75 @@
           <w:color w:val="555555"/>
           <w:sz w:val="22"/>
         </w:rPr>
-        <w:t>Common problems and fixes.</w:t>
+        <w:t>About 1 hour per day. Session recordings are not required unless management asks. Daily git push is required.</w:t>
+      </w:r>
+    </w:p>
+    <w:tbl>
+      <w:tblPr>
+        <w:tblW w:type="auto" w:w="0"/>
+        <w:tblLook w:firstColumn="1" w:firstRow="1" w:lastColumn="0" w:lastRow="0" w:noHBand="0" w:noVBand="1" w:val="04A0"/>
+      </w:tblPr>
+      <w:tblGrid>
+        <w:gridCol w:w="9360"/>
+      </w:tblGrid>
+      <w:tr>
+        <w:tc>
+          <w:tcPr>
+            <w:tcW w:type="dxa" w:w="9360"/>
+            <w:shd w:fill="E8F8EF" w:val="clear"/>
+            <w:tcBorders>
+              <w:top w:val="single" w:sz="4" w:color="CCCCCC"/>
+              <w:left w:val="single" w:sz="4" w:color="CCCCCC"/>
+              <w:bottom w:val="single" w:sz="4" w:color="CCCCCC"/>
+              <w:right w:val="single" w:sz="4" w:color="CCCCCC"/>
+            </w:tcBorders>
+          </w:tcPr>
+          <w:p>
+            <w:pPr>
+              <w:spacing w:before="160" w:after="160"/>
+            </w:pPr>
+            <w:r>
+              <w:rPr>
+                <w:rFonts w:ascii="Consolas" w:hAnsi="Consolas"/>
+                <w:b/>
+                <w:i w:val="0"/>
+                <w:color w:val="3DD68C"/>
+                <w:sz w:val="17"/>
+              </w:rPr>
+              <w:t xml:space="preserve">DAILY WORKFLOW  </w:t>
+            </w:r>
+            <w:r>
+              <w:rPr>
+                <w:rFonts w:ascii="Calibri" w:hAnsi="Calibri"/>
+                <w:b w:val="0"/>
+                <w:i w:val="0"/>
+                <w:color w:val="222222"/>
+                <w:sz w:val="21"/>
+              </w:rPr>
+              <w:t>1. Open PowerShell.  2. cd $HOME\Documents\ustud  3. git pull  4. Session Start in Cursor  5. Complete that day's task  6. Session End  7. git add ., commit, push</w:t>
+            </w:r>
+          </w:p>
+        </w:tc>
+      </w:tr>
+    </w:tbl>
+    <w:p>
+      <w:pPr>
+        <w:spacing w:after="160"/>
+      </w:pPr>
+    </w:p>
+    <w:p>
+      <w:pPr>
+        <w:spacing w:after="200" w:lineRule="auto" w:line="300"/>
+      </w:pPr>
+      <w:r>
+        <w:rPr>
+          <w:rFonts w:ascii="Calibri" w:hAnsi="Calibri"/>
+          <w:b w:val="0"/>
+          <w:i w:val="0"/>
+          <w:color w:val="222222"/>
+          <w:sz w:val="22"/>
+        </w:rPr>
+        <w:t>Update progress/WEEK2_LOG.md each day (same format as WEEK1_LOG.md). Use progress/DAILY_LOG.md for detailed work entries.</w:t>
       </w:r>
     </w:p>
     <w:p>
@@ -6550,7 +6914,7 @@
           <w:color w:val="080808"/>
           <w:sz w:val="28"/>
         </w:rPr>
-        <w:t>Push failed: Permission denied (403)</w:t>
+        <w:t>Week 2, Monday — Codebase Orientation</w:t>
       </w:r>
     </w:p>
     <w:p>
@@ -6565,7 +6929,7 @@
           <w:color w:val="222222"/>
           <w:sz w:val="22"/>
         </w:rPr>
-        <w:t>You are logged into the wrong GitHub account.</w:t>
+        <w:t>Objective: Understand where code, UI, and course content live before making changes.</w:t>
       </w:r>
     </w:p>
     <w:p>
@@ -6580,7 +6944,7 @@
           <w:color w:val="080808"/>
           <w:sz w:val="23"/>
         </w:rPr>
-        <w:t>Step 1. Install GitHub CLI</w:t>
+        <w:t>Step 1. Pull latest code</w:t>
       </w:r>
     </w:p>
     <w:p>
@@ -6596,11 +6960,2163 @@
           <w:color w:val="222222"/>
           <w:sz w:val="22"/>
         </w:rPr>
+        <w:t>Open PowerShell in the ustud folder.</w:t>
+      </w:r>
+    </w:p>
+    <w:p>
+      <w:pPr>
+        <w:spacing w:before="120" w:after="40"/>
+        <w:ind w:left="360"/>
+      </w:pPr>
+      <w:r>
+        <w:rPr>
+          <w:rFonts w:ascii="Calibri" w:hAnsi="Calibri"/>
+          <w:b w:val="0"/>
+          <w:i/>
+          <w:color w:val="9A9A9A"/>
+          <w:sz w:val="20"/>
+        </w:rPr>
+        <w:t>Copy this line, paste into PowerShell, press Enter:</w:t>
+      </w:r>
+    </w:p>
+    <w:tbl>
+      <w:tblPr>
+        <w:tblW w:type="auto" w:w="0"/>
+        <w:tblLook w:firstColumn="1" w:firstRow="1" w:lastColumn="0" w:lastRow="0" w:noHBand="0" w:noVBand="1" w:val="04A0"/>
+      </w:tblPr>
+      <w:tblGrid>
+        <w:gridCol w:w="9360"/>
+      </w:tblGrid>
+      <w:tr>
+        <w:tc>
+          <w:tcPr>
+            <w:tcW w:type="dxa" w:w="9360"/>
+            <w:shd w:fill="0A0A0A" w:val="clear"/>
+            <w:tcBorders>
+              <w:top w:val="single" w:sz="4" w:color="1A1A1A"/>
+              <w:left w:val="single" w:sz="4" w:color="1A1A1A"/>
+              <w:bottom w:val="single" w:sz="4" w:color="1A1A1A"/>
+              <w:right w:val="single" w:sz="4" w:color="1A1A1A"/>
+            </w:tcBorders>
+          </w:tcPr>
+          <w:p>
+            <w:pPr>
+              <w:spacing w:before="160" w:after="160"/>
+            </w:pPr>
+            <w:r>
+              <w:rPr>
+                <w:rFonts w:ascii="Consolas" w:hAnsi="Consolas"/>
+                <w:b w:val="0"/>
+                <w:i w:val="0"/>
+                <w:color w:val="F0F0F0"/>
+                <w:sz w:val="20"/>
+              </w:rPr>
+              <w:t>git pull</w:t>
+            </w:r>
+          </w:p>
+        </w:tc>
+      </w:tr>
+    </w:tbl>
+    <w:p>
+      <w:pPr>
+        <w:spacing w:after="120"/>
+        <w:ind w:left="360"/>
+      </w:pPr>
+    </w:p>
+    <w:p>
+      <w:pPr>
+        <w:spacing w:before="80" w:after="200"/>
+        <w:ind w:left="360"/>
+      </w:pPr>
+      <w:r>
+        <w:rPr>
+          <w:rFonts w:ascii="Calibri" w:hAnsi="Calibri"/>
+          <w:b/>
+          <w:i w:val="0"/>
+          <w:color w:val="3DD68C"/>
+          <w:sz w:val="21"/>
+        </w:rPr>
+        <w:t xml:space="preserve">You should see: </w:t>
+      </w:r>
+      <w:r>
+        <w:rPr>
+          <w:rFonts w:ascii="Calibri" w:hAnsi="Calibri"/>
+          <w:b w:val="0"/>
+          <w:i w:val="0"/>
+          <w:color w:val="222222"/>
+          <w:sz w:val="21"/>
+        </w:rPr>
+        <w:t>Success message</w:t>
+      </w:r>
+    </w:p>
+    <w:p>
+      <w:pPr>
+        <w:spacing w:before="240" w:after="120"/>
+      </w:pPr>
+      <w:r>
+        <w:rPr>
+          <w:rFonts w:ascii="Calibri" w:hAnsi="Calibri"/>
+          <w:b/>
+          <w:i w:val="0"/>
+          <w:color w:val="080808"/>
+          <w:sz w:val="23"/>
+        </w:rPr>
+        <w:t>Step 2. Start Cursor session</w:t>
+      </w:r>
+    </w:p>
+    <w:p>
+      <w:pPr>
+        <w:spacing w:after="80" w:lineRule="auto" w:line="300"/>
+        <w:ind w:left="360"/>
+      </w:pPr>
+      <w:r>
+        <w:rPr>
+          <w:rFonts w:ascii="Calibri" w:hAnsi="Calibri"/>
+          <w:b w:val="0"/>
+          <w:i w:val="0"/>
+          <w:color w:val="222222"/>
+          <w:sz w:val="22"/>
+        </w:rPr>
+        <w:t>Paste Session Start from Part 7.</w:t>
+      </w:r>
+    </w:p>
+    <w:p>
+      <w:pPr>
+        <w:spacing w:after="80" w:lineRule="auto" w:line="300"/>
+        <w:ind w:left="360"/>
+      </w:pPr>
+      <w:r>
+        <w:rPr>
+          <w:rFonts w:ascii="Calibri" w:hAnsi="Calibri"/>
+          <w:b w:val="0"/>
+          <w:i w:val="0"/>
+          <w:color w:val="222222"/>
+          <w:sz w:val="22"/>
+        </w:rPr>
+        <w:t>Ask Cursor to walk through these folders one at a time:</w:t>
+      </w:r>
+    </w:p>
+    <w:p>
+      <w:pPr>
+        <w:pStyle w:val="ListBullet"/>
+        <w:spacing w:after="100"/>
+      </w:pPr>
+      <w:r>
+        <w:rPr>
+          <w:rFonts w:ascii="Calibri" w:hAnsi="Calibri"/>
+          <w:b w:val="0"/>
+          <w:i w:val="0"/>
+          <w:color w:val="222222"/>
+          <w:sz w:val="22"/>
+        </w:rPr>
+        <w:t>src/ustud/ - Python backend (API, AI tutor logic)</w:t>
+      </w:r>
+    </w:p>
+    <w:p>
+      <w:pPr>
+        <w:pStyle w:val="ListBullet"/>
+        <w:spacing w:after="100"/>
+      </w:pPr>
+      <w:r>
+        <w:rPr>
+          <w:rFonts w:ascii="Calibri" w:hAnsi="Calibri"/>
+          <w:b w:val="0"/>
+          <w:i w:val="0"/>
+          <w:color w:val="222222"/>
+          <w:sz w:val="22"/>
+        </w:rPr>
+        <w:t>boiler/ - React user interface</w:t>
+      </w:r>
+    </w:p>
+    <w:p>
+      <w:pPr>
+        <w:pStyle w:val="ListBullet"/>
+        <w:spacing w:after="100"/>
+      </w:pPr>
+      <w:r>
+        <w:rPr>
+          <w:rFonts w:ascii="Calibri" w:hAnsi="Calibri"/>
+          <w:b w:val="0"/>
+          <w:i w:val="0"/>
+          <w:color w:val="222222"/>
+          <w:sz w:val="22"/>
+        </w:rPr>
+        <w:t>modules/ - course content and curriculum</w:t>
+      </w:r>
+    </w:p>
+    <w:p>
+      <w:pPr>
+        <w:pStyle w:val="ListBullet"/>
+        <w:spacing w:after="100"/>
+      </w:pPr>
+      <w:r>
+        <w:rPr>
+          <w:rFonts w:ascii="Calibri" w:hAnsi="Calibri"/>
+          <w:b w:val="0"/>
+          <w:i w:val="0"/>
+          <w:color w:val="222222"/>
+          <w:sz w:val="22"/>
+        </w:rPr>
+        <w:t>progress/ - your logs and project status files</w:t>
+      </w:r>
+    </w:p>
+    <w:p>
+      <w:pPr>
+        <w:spacing w:before="240" w:after="120"/>
+      </w:pPr>
+      <w:r>
+        <w:rPr>
+          <w:rFonts w:ascii="Calibri" w:hAnsi="Calibri"/>
+          <w:b/>
+          <w:i w:val="0"/>
+          <w:color w:val="080808"/>
+          <w:sz w:val="23"/>
+        </w:rPr>
+        <w:t>Step 3. Update progress/CURRENT_STATE.md</w:t>
+      </w:r>
+    </w:p>
+    <w:p>
+      <w:pPr>
+        <w:spacing w:after="80" w:lineRule="auto" w:line="300"/>
+        <w:ind w:left="360"/>
+      </w:pPr>
+      <w:r>
+        <w:rPr>
+          <w:rFonts w:ascii="Calibri" w:hAnsi="Calibri"/>
+          <w:b w:val="0"/>
+          <w:i w:val="0"/>
+          <w:color w:val="222222"/>
+          <w:sz w:val="22"/>
+        </w:rPr>
+        <w:t>Expand your Week 1 gap list into full sentences.</w:t>
+      </w:r>
+    </w:p>
+    <w:p>
+      <w:pPr>
+        <w:spacing w:after="80" w:lineRule="auto" w:line="300"/>
+        <w:ind w:left="360"/>
+      </w:pPr>
+      <w:r>
+        <w:rPr>
+          <w:rFonts w:ascii="Calibri" w:hAnsi="Calibri"/>
+          <w:b w:val="0"/>
+          <w:i w:val="0"/>
+          <w:color w:val="222222"/>
+          <w:sz w:val="22"/>
+        </w:rPr>
+        <w:t>Add a section: Recommended next task (pick the smallest gap).</w:t>
+      </w:r>
+    </w:p>
+    <w:p>
+      <w:pPr>
+        <w:spacing w:after="80" w:lineRule="auto" w:line="300"/>
+        <w:ind w:left="360"/>
+      </w:pPr>
+      <w:r>
+        <w:rPr>
+          <w:rFonts w:ascii="Calibri" w:hAnsi="Calibri"/>
+          <w:b w:val="0"/>
+          <w:i w:val="0"/>
+          <w:color w:val="222222"/>
+          <w:sz w:val="22"/>
+        </w:rPr>
+        <w:t>Session End, then git add ., commit, push.</w:t>
+      </w:r>
+    </w:p>
+    <w:p>
+      <w:pPr>
+        <w:spacing w:before="240" w:after="120"/>
+      </w:pPr>
+      <w:r>
+        <w:rPr>
+          <w:rFonts w:ascii="Calibri" w:hAnsi="Calibri"/>
+          <w:b/>
+          <w:i w:val="0"/>
+          <w:color w:val="080808"/>
+          <w:sz w:val="23"/>
+        </w:rPr>
+        <w:t>Step 4. Log Week 2 progress</w:t>
+      </w:r>
+    </w:p>
+    <w:p>
+      <w:pPr>
+        <w:spacing w:after="80" w:lineRule="auto" w:line="300"/>
+        <w:ind w:left="360"/>
+      </w:pPr>
+      <w:r>
+        <w:rPr>
+          <w:rFonts w:ascii="Calibri" w:hAnsi="Calibri"/>
+          <w:b w:val="0"/>
+          <w:i w:val="0"/>
+          <w:color w:val="222222"/>
+          <w:sz w:val="22"/>
+        </w:rPr>
+        <w:t>Fill Monday section in progress/WEEK2_LOG.md.</w:t>
+      </w:r>
+    </w:p>
+    <w:p>
+      <w:pPr>
+        <w:spacing w:after="80" w:lineRule="auto" w:line="300"/>
+        <w:ind w:left="360"/>
+      </w:pPr>
+      <w:r>
+        <w:rPr>
+          <w:rFonts w:ascii="Calibri" w:hAnsi="Calibri"/>
+          <w:b w:val="0"/>
+          <w:i w:val="0"/>
+          <w:color w:val="222222"/>
+          <w:sz w:val="22"/>
+        </w:rPr>
+        <w:t>Commit and push.</w:t>
+      </w:r>
+    </w:p>
+    <w:p>
+      <w:pPr>
+        <w:spacing w:before="0" w:after="0"/>
+      </w:pPr>
+      <w:r>
+        <w:br w:type="page"/>
+      </w:r>
+    </w:p>
+    <w:p>
+      <w:pPr>
+        <w:spacing w:before="320" w:after="160"/>
+      </w:pPr>
+      <w:r>
+        <w:rPr>
+          <w:rFonts w:ascii="Arial" w:hAnsi="Arial"/>
+          <w:b/>
+          <w:i w:val="0"/>
+          <w:color w:val="080808"/>
+          <w:sz w:val="28"/>
+        </w:rPr>
+        <w:t>Week 2, Tuesday — First Development Task</w:t>
+      </w:r>
+    </w:p>
+    <w:p>
+      <w:pPr>
+        <w:spacing w:after="200" w:lineRule="auto" w:line="300"/>
+      </w:pPr>
+      <w:r>
+        <w:rPr>
+          <w:rFonts w:ascii="Calibri" w:hAnsi="Calibri"/>
+          <w:b w:val="0"/>
+          <w:i w:val="0"/>
+          <w:color w:val="222222"/>
+          <w:sz w:val="22"/>
+        </w:rPr>
+        <w:t>Objective: Ship one improvement tied to gap #1 in CURRENT_STATE.md.</w:t>
+      </w:r>
+    </w:p>
+    <w:p>
+      <w:pPr>
+        <w:spacing w:before="240" w:after="120"/>
+      </w:pPr>
+      <w:r>
+        <w:rPr>
+          <w:rFonts w:ascii="Calibri" w:hAnsi="Calibri"/>
+          <w:b/>
+          <w:i w:val="0"/>
+          <w:color w:val="080808"/>
+          <w:sz w:val="23"/>
+        </w:rPr>
+        <w:t>Step 1. Pull and start session</w:t>
+      </w:r>
+    </w:p>
+    <w:p>
+      <w:pPr>
+        <w:spacing w:before="120" w:after="40"/>
+        <w:ind w:left="360"/>
+      </w:pPr>
+      <w:r>
+        <w:rPr>
+          <w:rFonts w:ascii="Calibri" w:hAnsi="Calibri"/>
+          <w:b w:val="0"/>
+          <w:i/>
+          <w:color w:val="9A9A9A"/>
+          <w:sz w:val="20"/>
+        </w:rPr>
+        <w:t>Copy this line, paste into PowerShell, press Enter:</w:t>
+      </w:r>
+    </w:p>
+    <w:tbl>
+      <w:tblPr>
+        <w:tblW w:type="auto" w:w="0"/>
+        <w:tblLook w:firstColumn="1" w:firstRow="1" w:lastColumn="0" w:lastRow="0" w:noHBand="0" w:noVBand="1" w:val="04A0"/>
+      </w:tblPr>
+      <w:tblGrid>
+        <w:gridCol w:w="9360"/>
+      </w:tblGrid>
+      <w:tr>
+        <w:tc>
+          <w:tcPr>
+            <w:tcW w:type="dxa" w:w="9360"/>
+            <w:shd w:fill="0A0A0A" w:val="clear"/>
+            <w:tcBorders>
+              <w:top w:val="single" w:sz="4" w:color="1A1A1A"/>
+              <w:left w:val="single" w:sz="4" w:color="1A1A1A"/>
+              <w:bottom w:val="single" w:sz="4" w:color="1A1A1A"/>
+              <w:right w:val="single" w:sz="4" w:color="1A1A1A"/>
+            </w:tcBorders>
+          </w:tcPr>
+          <w:p>
+            <w:pPr>
+              <w:spacing w:before="160" w:after="160"/>
+            </w:pPr>
+            <w:r>
+              <w:rPr>
+                <w:rFonts w:ascii="Consolas" w:hAnsi="Consolas"/>
+                <w:b w:val="0"/>
+                <w:i w:val="0"/>
+                <w:color w:val="F0F0F0"/>
+                <w:sz w:val="20"/>
+              </w:rPr>
+              <w:t>git pull</w:t>
+            </w:r>
+          </w:p>
+        </w:tc>
+      </w:tr>
+    </w:tbl>
+    <w:p>
+      <w:pPr>
+        <w:spacing w:after="120"/>
+        <w:ind w:left="360"/>
+      </w:pPr>
+    </w:p>
+    <w:p>
+      <w:pPr>
+        <w:spacing w:before="80" w:after="200"/>
+        <w:ind w:left="360"/>
+      </w:pPr>
+      <w:r>
+        <w:rPr>
+          <w:rFonts w:ascii="Calibri" w:hAnsi="Calibri"/>
+          <w:b/>
+          <w:i w:val="0"/>
+          <w:color w:val="3DD68C"/>
+          <w:sz w:val="21"/>
+        </w:rPr>
+        <w:t xml:space="preserve">You should see: </w:t>
+      </w:r>
+      <w:r>
+        <w:rPr>
+          <w:rFonts w:ascii="Calibri" w:hAnsi="Calibri"/>
+          <w:b w:val="0"/>
+          <w:i w:val="0"/>
+          <w:color w:val="222222"/>
+          <w:sz w:val="21"/>
+        </w:rPr>
+        <w:t>Success</w:t>
+      </w:r>
+    </w:p>
+    <w:p>
+      <w:pPr>
+        <w:spacing w:before="240" w:after="120"/>
+      </w:pPr>
+      <w:r>
+        <w:rPr>
+          <w:rFonts w:ascii="Calibri" w:hAnsi="Calibri"/>
+          <w:b/>
+          <w:i w:val="0"/>
+          <w:color w:val="080808"/>
+          <w:sz w:val="23"/>
+        </w:rPr>
+        <w:t>Step 2. Implement gap #1</w:t>
+      </w:r>
+    </w:p>
+    <w:p>
+      <w:pPr>
+        <w:spacing w:after="80" w:lineRule="auto" w:line="300"/>
+        <w:ind w:left="360"/>
+      </w:pPr>
+      <w:r>
+        <w:rPr>
+          <w:rFonts w:ascii="Calibri" w:hAnsi="Calibri"/>
+          <w:b w:val="0"/>
+          <w:i w:val="0"/>
+          <w:color w:val="222222"/>
+          <w:sz w:val="22"/>
+        </w:rPr>
+        <w:t>Session Start in Cursor.</w:t>
+      </w:r>
+    </w:p>
+    <w:p>
+      <w:pPr>
+        <w:spacing w:after="80" w:lineRule="auto" w:line="300"/>
+        <w:ind w:left="360"/>
+      </w:pPr>
+      <w:r>
+        <w:rPr>
+          <w:rFonts w:ascii="Calibri" w:hAnsi="Calibri"/>
+          <w:b w:val="0"/>
+          <w:i w:val="0"/>
+          <w:color w:val="222222"/>
+          <w:sz w:val="22"/>
+        </w:rPr>
+        <w:t>Tell Cursor: Help me implement the first gap listed in progress/CURRENT_STATE.md. Keep the change small.</w:t>
+      </w:r>
+    </w:p>
+    <w:p>
+      <w:pPr>
+        <w:spacing w:after="80" w:lineRule="auto" w:line="300"/>
+        <w:ind w:left="360"/>
+      </w:pPr>
+      <w:r>
+        <w:rPr>
+          <w:rFonts w:ascii="Calibri" w:hAnsi="Calibri"/>
+          <w:b w:val="0"/>
+          <w:i w:val="0"/>
+          <w:color w:val="222222"/>
+          <w:sz w:val="22"/>
+        </w:rPr>
+        <w:t>Test locally if the app is running (npm run dev:all).</w:t>
+      </w:r>
+    </w:p>
+    <w:p>
+      <w:pPr>
+        <w:spacing w:before="240" w:after="120"/>
+      </w:pPr>
+      <w:r>
+        <w:rPr>
+          <w:rFonts w:ascii="Calibri" w:hAnsi="Calibri"/>
+          <w:b/>
+          <w:i w:val="0"/>
+          <w:color w:val="080808"/>
+          <w:sz w:val="23"/>
+        </w:rPr>
+        <w:t>Step 3. Document and push</w:t>
+      </w:r>
+    </w:p>
+    <w:p>
+      <w:pPr>
+        <w:spacing w:after="80" w:lineRule="auto" w:line="300"/>
+        <w:ind w:left="360"/>
+      </w:pPr>
+      <w:r>
+        <w:rPr>
+          <w:rFonts w:ascii="Calibri" w:hAnsi="Calibri"/>
+          <w:b w:val="0"/>
+          <w:i w:val="0"/>
+          <w:color w:val="222222"/>
+          <w:sz w:val="22"/>
+        </w:rPr>
+        <w:t>Session End — confirm DAILY_LOG.md and CURRENT_STATE.md are updated.</w:t>
+      </w:r>
+    </w:p>
+    <w:p>
+      <w:pPr>
+        <w:spacing w:after="80" w:lineRule="auto" w:line="300"/>
+        <w:ind w:left="360"/>
+      </w:pPr>
+      <w:r>
+        <w:rPr>
+          <w:rFonts w:ascii="Calibri" w:hAnsi="Calibri"/>
+          <w:b w:val="0"/>
+          <w:i w:val="0"/>
+          <w:color w:val="222222"/>
+          <w:sz w:val="22"/>
+        </w:rPr>
+        <w:t>Fill Tuesday section in WEEK2_LOG.md.</w:t>
+      </w:r>
+    </w:p>
+    <w:tbl>
+      <w:tblPr>
+        <w:tblW w:type="auto" w:w="0"/>
+        <w:tblLook w:firstColumn="1" w:firstRow="1" w:lastColumn="0" w:lastRow="0" w:noHBand="0" w:noVBand="1" w:val="04A0"/>
+      </w:tblPr>
+      <w:tblGrid>
+        <w:gridCol w:w="9360"/>
+      </w:tblGrid>
+      <w:tr>
+        <w:tc>
+          <w:tcPr>
+            <w:tcW w:type="dxa" w:w="9360"/>
+            <w:shd w:fill="0A0A0A" w:val="clear"/>
+            <w:tcBorders>
+              <w:top w:val="single" w:sz="4" w:color="1A1A1A"/>
+              <w:left w:val="single" w:sz="4" w:color="1A1A1A"/>
+              <w:bottom w:val="single" w:sz="4" w:color="1A1A1A"/>
+              <w:right w:val="single" w:sz="4" w:color="1A1A1A"/>
+            </w:tcBorders>
+          </w:tcPr>
+          <w:p>
+            <w:pPr>
+              <w:spacing w:before="160" w:after="160"/>
+            </w:pPr>
+            <w:r>
+              <w:rPr>
+                <w:rFonts w:ascii="Consolas" w:hAnsi="Consolas"/>
+                <w:b w:val="0"/>
+                <w:i w:val="0"/>
+                <w:color w:val="F0F0F0"/>
+                <w:sz w:val="20"/>
+              </w:rPr>
+              <w:t>git add .</w:t>
+              <w:br/>
+              <w:t>git commit -m "Week2 Day2: first development task - [brief description]"</w:t>
+              <w:br/>
+              <w:t>git push</w:t>
+            </w:r>
+          </w:p>
+        </w:tc>
+      </w:tr>
+    </w:tbl>
+    <w:p>
+      <w:pPr>
+        <w:spacing w:after="120"/>
+      </w:pPr>
+    </w:p>
+    <w:p>
+      <w:pPr>
+        <w:spacing w:before="0" w:after="0"/>
+      </w:pPr>
+      <w:r>
+        <w:br w:type="page"/>
+      </w:r>
+    </w:p>
+    <w:p>
+      <w:pPr>
+        <w:spacing w:before="320" w:after="160"/>
+      </w:pPr>
+      <w:r>
+        <w:rPr>
+          <w:rFonts w:ascii="Arial" w:hAnsi="Arial"/>
+          <w:b/>
+          <w:i w:val="0"/>
+          <w:color w:val="080808"/>
+          <w:sz w:val="28"/>
+        </w:rPr>
+        <w:t>Week 2, Wednesday — AI Integration</w:t>
+      </w:r>
+    </w:p>
+    <w:p>
+      <w:pPr>
+        <w:spacing w:after="200" w:lineRule="auto" w:line="300"/>
+      </w:pPr>
+      <w:r>
+        <w:rPr>
+          <w:rFonts w:ascii="Calibri" w:hAnsi="Calibri"/>
+          <w:b w:val="0"/>
+          <w:i w:val="0"/>
+          <w:color w:val="222222"/>
+          <w:sz w:val="22"/>
+        </w:rPr>
+        <w:t>Objective: Connect training to the product. Finish NVIDIA RAG content and test the offline tutor.</w:t>
+      </w:r>
+    </w:p>
+    <w:p>
+      <w:pPr>
+        <w:spacing w:before="240" w:after="120"/>
+      </w:pPr>
+      <w:r>
+        <w:rPr>
+          <w:rFonts w:ascii="Calibri" w:hAnsi="Calibri"/>
+          <w:b/>
+          <w:i w:val="0"/>
+          <w:color w:val="080808"/>
+          <w:sz w:val="23"/>
+        </w:rPr>
+        <w:t>Step 1. Complete NVIDIA course</w:t>
+      </w:r>
+    </w:p>
+    <w:p>
+      <w:pPr>
+        <w:spacing w:after="80" w:lineRule="auto" w:line="300"/>
+        <w:ind w:left="360"/>
+      </w:pPr>
+      <w:r>
+        <w:rPr>
+          <w:rFonts w:ascii="Calibri" w:hAnsi="Calibri"/>
+          <w:b w:val="0"/>
+          <w:i w:val="0"/>
+          <w:color w:val="222222"/>
+          <w:sz w:val="22"/>
+        </w:rPr>
+        <w:t>Finish Generative AI Explained or complete Augment Your LLM Using RAG.</w:t>
+      </w:r>
+    </w:p>
+    <w:p>
+      <w:hyperlink r:id="rId20">
+        <w:r>
+          <w:rPr>
+            <w:color w:val="4A9EFF"/>
+            <w:u w:val="single"/>
+          </w:rPr>
+          <w:t>https://www.nvidia.com/en-us/training/self-paced-courses/</w:t>
+        </w:r>
+      </w:hyperlink>
+    </w:p>
+    <w:p>
+      <w:pPr>
+        <w:spacing w:before="240" w:after="120"/>
+      </w:pPr>
+      <w:r>
+        <w:rPr>
+          <w:rFonts w:ascii="Calibri" w:hAnsi="Calibri"/>
+          <w:b/>
+          <w:i w:val="0"/>
+          <w:color w:val="080808"/>
+          <w:sz w:val="23"/>
+        </w:rPr>
+        <w:t>Step 2. Test UStud tutor</w:t>
+      </w:r>
+    </w:p>
+    <w:p>
+      <w:pPr>
+        <w:spacing w:after="80" w:lineRule="auto" w:line="300"/>
+        <w:ind w:left="360"/>
+      </w:pPr>
+      <w:r>
+        <w:rPr>
+          <w:rFonts w:ascii="Calibri" w:hAnsi="Calibri"/>
+          <w:b w:val="0"/>
+          <w:i w:val="0"/>
+          <w:color w:val="222222"/>
+          <w:sz w:val="22"/>
+        </w:rPr>
+        <w:t>Ensure the app is running (npm run dev:all).</w:t>
+      </w:r>
+    </w:p>
+    <w:p>
+      <w:pPr>
+        <w:spacing w:after="80" w:lineRule="auto" w:line="300"/>
+        <w:ind w:left="360"/>
+      </w:pPr>
+      <w:r>
+        <w:rPr>
+          <w:rFonts w:ascii="Calibri" w:hAnsi="Calibri"/>
+          <w:b w:val="0"/>
+          <w:i w:val="0"/>
+          <w:color w:val="222222"/>
+          <w:sz w:val="22"/>
+        </w:rPr>
+        <w:t>Open http://localhost:5173</w:t>
+      </w:r>
+    </w:p>
+    <w:p>
+      <w:pPr>
+        <w:spacing w:after="80" w:lineRule="auto" w:line="300"/>
+        <w:ind w:left="360"/>
+      </w:pPr>
+      <w:r>
+        <w:rPr>
+          <w:rFonts w:ascii="Calibri" w:hAnsi="Calibri"/>
+          <w:b w:val="0"/>
+          <w:i w:val="0"/>
+          <w:color w:val="222222"/>
+          <w:sz w:val="22"/>
+        </w:rPr>
+        <w:t>Ask the offline tutor one question about a lesson topic.</w:t>
+      </w:r>
+    </w:p>
+    <w:p>
+      <w:pPr>
+        <w:spacing w:after="80" w:lineRule="auto" w:line="300"/>
+        <w:ind w:left="360"/>
+      </w:pPr>
+      <w:r>
+        <w:rPr>
+          <w:rFonts w:ascii="Calibri" w:hAnsi="Calibri"/>
+          <w:b w:val="0"/>
+          <w:i w:val="0"/>
+          <w:color w:val="222222"/>
+          <w:sz w:val="22"/>
+        </w:rPr>
+        <w:t>Note in WEEK2_LOG.md: Did it work? What would improve the response?</w:t>
+      </w:r>
+    </w:p>
+    <w:p>
+      <w:pPr>
+        <w:spacing w:before="240" w:after="120"/>
+      </w:pPr>
+      <w:r>
+        <w:rPr>
+          <w:rFonts w:ascii="Calibri" w:hAnsi="Calibri"/>
+          <w:b/>
+          <w:i w:val="0"/>
+          <w:color w:val="080808"/>
+          <w:sz w:val="23"/>
+        </w:rPr>
+        <w:t>Step 3. Push your notes</w:t>
+      </w:r>
+    </w:p>
+    <w:p>
+      <w:pPr>
+        <w:spacing w:before="120" w:after="40"/>
+        <w:ind w:left="360"/>
+      </w:pPr>
+      <w:r>
+        <w:rPr>
+          <w:rFonts w:ascii="Calibri" w:hAnsi="Calibri"/>
+          <w:b w:val="0"/>
+          <w:i/>
+          <w:color w:val="9A9A9A"/>
+          <w:sz w:val="20"/>
+        </w:rPr>
+        <w:t>Copy this line, paste into PowerShell, press Enter:</w:t>
+      </w:r>
+    </w:p>
+    <w:tbl>
+      <w:tblPr>
+        <w:tblW w:type="auto" w:w="0"/>
+        <w:tblLook w:firstColumn="1" w:firstRow="1" w:lastColumn="0" w:lastRow="0" w:noHBand="0" w:noVBand="1" w:val="04A0"/>
+      </w:tblPr>
+      <w:tblGrid>
+        <w:gridCol w:w="9360"/>
+      </w:tblGrid>
+      <w:tr>
+        <w:tc>
+          <w:tcPr>
+            <w:tcW w:type="dxa" w:w="9360"/>
+            <w:shd w:fill="0A0A0A" w:val="clear"/>
+            <w:tcBorders>
+              <w:top w:val="single" w:sz="4" w:color="1A1A1A"/>
+              <w:left w:val="single" w:sz="4" w:color="1A1A1A"/>
+              <w:bottom w:val="single" w:sz="4" w:color="1A1A1A"/>
+              <w:right w:val="single" w:sz="4" w:color="1A1A1A"/>
+            </w:tcBorders>
+          </w:tcPr>
+          <w:p>
+            <w:pPr>
+              <w:spacing w:before="160" w:after="160"/>
+            </w:pPr>
+            <w:r>
+              <w:rPr>
+                <w:rFonts w:ascii="Consolas" w:hAnsi="Consolas"/>
+                <w:b w:val="0"/>
+                <w:i w:val="0"/>
+                <w:color w:val="F0F0F0"/>
+                <w:sz w:val="20"/>
+              </w:rPr>
+              <w:t>git pull</w:t>
+            </w:r>
+          </w:p>
+        </w:tc>
+      </w:tr>
+    </w:tbl>
+    <w:p>
+      <w:pPr>
+        <w:spacing w:after="120"/>
+        <w:ind w:left="360"/>
+      </w:pPr>
+    </w:p>
+    <w:p>
+      <w:pPr>
+        <w:spacing w:before="80" w:after="200"/>
+        <w:ind w:left="360"/>
+      </w:pPr>
+      <w:r>
+        <w:rPr>
+          <w:rFonts w:ascii="Calibri" w:hAnsi="Calibri"/>
+          <w:b/>
+          <w:i w:val="0"/>
+          <w:color w:val="3DD68C"/>
+          <w:sz w:val="21"/>
+        </w:rPr>
+        <w:t xml:space="preserve">You should see: </w:t>
+      </w:r>
+      <w:r>
+        <w:rPr>
+          <w:rFonts w:ascii="Calibri" w:hAnsi="Calibri"/>
+          <w:b w:val="0"/>
+          <w:i w:val="0"/>
+          <w:color w:val="222222"/>
+          <w:sz w:val="21"/>
+        </w:rPr>
+        <w:t>Success</w:t>
+      </w:r>
+    </w:p>
+    <w:p>
+      <w:pPr>
+        <w:spacing w:before="240" w:after="120"/>
+      </w:pPr>
+      <w:r>
+        <w:rPr>
+          <w:rFonts w:ascii="Calibri" w:hAnsi="Calibri"/>
+          <w:b/>
+          <w:i w:val="0"/>
+          <w:color w:val="080808"/>
+          <w:sz w:val="23"/>
+        </w:rPr>
+        <w:t>Step 4. Commit log updates</w:t>
+      </w:r>
+    </w:p>
+    <w:p>
+      <w:pPr>
+        <w:spacing w:after="80" w:lineRule="auto" w:line="300"/>
+        <w:ind w:left="360"/>
+      </w:pPr>
+      <w:r>
+        <w:rPr>
+          <w:rFonts w:ascii="Calibri" w:hAnsi="Calibri"/>
+          <w:b w:val="0"/>
+          <w:i w:val="0"/>
+          <w:color w:val="222222"/>
+          <w:sz w:val="22"/>
+        </w:rPr>
+        <w:t>After editing WEEK2_LOG.md and DAILY_LOG.md:</w:t>
+      </w:r>
+    </w:p>
+    <w:p>
+      <w:pPr>
+        <w:spacing w:before="120" w:after="40"/>
+        <w:ind w:left="360"/>
+      </w:pPr>
+      <w:r>
+        <w:rPr>
+          <w:rFonts w:ascii="Calibri" w:hAnsi="Calibri"/>
+          <w:b w:val="0"/>
+          <w:i/>
+          <w:color w:val="9A9A9A"/>
+          <w:sz w:val="20"/>
+        </w:rPr>
+        <w:t>Copy this line, paste into PowerShell, press Enter:</w:t>
+      </w:r>
+    </w:p>
+    <w:tbl>
+      <w:tblPr>
+        <w:tblW w:type="auto" w:w="0"/>
+        <w:tblLook w:firstColumn="1" w:firstRow="1" w:lastColumn="0" w:lastRow="0" w:noHBand="0" w:noVBand="1" w:val="04A0"/>
+      </w:tblPr>
+      <w:tblGrid>
+        <w:gridCol w:w="9360"/>
+      </w:tblGrid>
+      <w:tr>
+        <w:tc>
+          <w:tcPr>
+            <w:tcW w:type="dxa" w:w="9360"/>
+            <w:shd w:fill="0A0A0A" w:val="clear"/>
+            <w:tcBorders>
+              <w:top w:val="single" w:sz="4" w:color="1A1A1A"/>
+              <w:left w:val="single" w:sz="4" w:color="1A1A1A"/>
+              <w:bottom w:val="single" w:sz="4" w:color="1A1A1A"/>
+              <w:right w:val="single" w:sz="4" w:color="1A1A1A"/>
+            </w:tcBorders>
+          </w:tcPr>
+          <w:p>
+            <w:pPr>
+              <w:spacing w:before="160" w:after="160"/>
+            </w:pPr>
+            <w:r>
+              <w:rPr>
+                <w:rFonts w:ascii="Consolas" w:hAnsi="Consolas"/>
+                <w:b w:val="0"/>
+                <w:i w:val="0"/>
+                <w:color w:val="F0F0F0"/>
+                <w:sz w:val="20"/>
+              </w:rPr>
+              <w:t>git add .</w:t>
+              <w:br/>
+              <w:t>git commit -m "Week2 Day3: AI integration notes and tutor test"</w:t>
+              <w:br/>
+              <w:t>git push</w:t>
+            </w:r>
+          </w:p>
+        </w:tc>
+      </w:tr>
+    </w:tbl>
+    <w:p>
+      <w:pPr>
+        <w:spacing w:after="120"/>
+        <w:ind w:left="360"/>
+      </w:pPr>
+    </w:p>
+    <w:p>
+      <w:pPr>
+        <w:spacing w:before="0" w:after="0"/>
+      </w:pPr>
+      <w:r>
+        <w:br w:type="page"/>
+      </w:r>
+    </w:p>
+    <w:p>
+      <w:pPr>
+        <w:spacing w:before="320" w:after="160"/>
+      </w:pPr>
+      <w:r>
+        <w:rPr>
+          <w:rFonts w:ascii="Arial" w:hAnsi="Arial"/>
+          <w:b/>
+          <w:i w:val="0"/>
+          <w:color w:val="080808"/>
+          <w:sz w:val="28"/>
+        </w:rPr>
+        <w:t>Week 2, Thursday — Second Development Task</w:t>
+      </w:r>
+    </w:p>
+    <w:p>
+      <w:pPr>
+        <w:spacing w:after="200" w:lineRule="auto" w:line="300"/>
+      </w:pPr>
+      <w:r>
+        <w:rPr>
+          <w:rFonts w:ascii="Calibri" w:hAnsi="Calibri"/>
+          <w:b w:val="0"/>
+          <w:i w:val="0"/>
+          <w:color w:val="222222"/>
+          <w:sz w:val="22"/>
+        </w:rPr>
+        <w:t>Objective: Deliver one UI or module improvement (gap #2 or related polish).</w:t>
+      </w:r>
+    </w:p>
+    <w:p>
+      <w:pPr>
+        <w:spacing w:before="240" w:after="120"/>
+      </w:pPr>
+      <w:r>
+        <w:rPr>
+          <w:rFonts w:ascii="Calibri" w:hAnsi="Calibri"/>
+          <w:b/>
+          <w:i w:val="0"/>
+          <w:color w:val="080808"/>
+          <w:sz w:val="23"/>
+        </w:rPr>
+        <w:t>Step 1. Pull and Session Start</w:t>
+      </w:r>
+    </w:p>
+    <w:p>
+      <w:pPr>
+        <w:spacing w:before="120" w:after="40"/>
+        <w:ind w:left="360"/>
+      </w:pPr>
+      <w:r>
+        <w:rPr>
+          <w:rFonts w:ascii="Calibri" w:hAnsi="Calibri"/>
+          <w:b w:val="0"/>
+          <w:i/>
+          <w:color w:val="9A9A9A"/>
+          <w:sz w:val="20"/>
+        </w:rPr>
+        <w:t>Copy this line, paste into PowerShell, press Enter:</w:t>
+      </w:r>
+    </w:p>
+    <w:tbl>
+      <w:tblPr>
+        <w:tblW w:type="auto" w:w="0"/>
+        <w:tblLook w:firstColumn="1" w:firstRow="1" w:lastColumn="0" w:lastRow="0" w:noHBand="0" w:noVBand="1" w:val="04A0"/>
+      </w:tblPr>
+      <w:tblGrid>
+        <w:gridCol w:w="9360"/>
+      </w:tblGrid>
+      <w:tr>
+        <w:tc>
+          <w:tcPr>
+            <w:tcW w:type="dxa" w:w="9360"/>
+            <w:shd w:fill="0A0A0A" w:val="clear"/>
+            <w:tcBorders>
+              <w:top w:val="single" w:sz="4" w:color="1A1A1A"/>
+              <w:left w:val="single" w:sz="4" w:color="1A1A1A"/>
+              <w:bottom w:val="single" w:sz="4" w:color="1A1A1A"/>
+              <w:right w:val="single" w:sz="4" w:color="1A1A1A"/>
+            </w:tcBorders>
+          </w:tcPr>
+          <w:p>
+            <w:pPr>
+              <w:spacing w:before="160" w:after="160"/>
+            </w:pPr>
+            <w:r>
+              <w:rPr>
+                <w:rFonts w:ascii="Consolas" w:hAnsi="Consolas"/>
+                <w:b w:val="0"/>
+                <w:i w:val="0"/>
+                <w:color w:val="F0F0F0"/>
+                <w:sz w:val="20"/>
+              </w:rPr>
+              <w:t>git pull</w:t>
+            </w:r>
+          </w:p>
+        </w:tc>
+      </w:tr>
+    </w:tbl>
+    <w:p>
+      <w:pPr>
+        <w:spacing w:after="120"/>
+        <w:ind w:left="360"/>
+      </w:pPr>
+    </w:p>
+    <w:p>
+      <w:pPr>
+        <w:spacing w:before="80" w:after="200"/>
+        <w:ind w:left="360"/>
+      </w:pPr>
+      <w:r>
+        <w:rPr>
+          <w:rFonts w:ascii="Calibri" w:hAnsi="Calibri"/>
+          <w:b/>
+          <w:i w:val="0"/>
+          <w:color w:val="3DD68C"/>
+          <w:sz w:val="21"/>
+        </w:rPr>
+        <w:t xml:space="preserve">You should see: </w:t>
+      </w:r>
+      <w:r>
+        <w:rPr>
+          <w:rFonts w:ascii="Calibri" w:hAnsi="Calibri"/>
+          <w:b w:val="0"/>
+          <w:i w:val="0"/>
+          <w:color w:val="222222"/>
+          <w:sz w:val="21"/>
+        </w:rPr>
+        <w:t>Success</w:t>
+      </w:r>
+    </w:p>
+    <w:p>
+      <w:pPr>
+        <w:spacing w:before="240" w:after="120"/>
+      </w:pPr>
+      <w:r>
+        <w:rPr>
+          <w:rFonts w:ascii="Calibri" w:hAnsi="Calibri"/>
+          <w:b/>
+          <w:i w:val="0"/>
+          <w:color w:val="080808"/>
+          <w:sz w:val="23"/>
+        </w:rPr>
+        <w:t>Step 2. Build and test</w:t>
+      </w:r>
+    </w:p>
+    <w:p>
+      <w:pPr>
+        <w:spacing w:after="80" w:lineRule="auto" w:line="300"/>
+        <w:ind w:left="360"/>
+      </w:pPr>
+      <w:r>
+        <w:rPr>
+          <w:rFonts w:ascii="Calibri" w:hAnsi="Calibri"/>
+          <w:b w:val="0"/>
+          <w:i w:val="0"/>
+          <w:color w:val="222222"/>
+          <w:sz w:val="22"/>
+        </w:rPr>
+        <w:t>Work in boiler/ (UI) or modules/ (content) with Cursor.</w:t>
+      </w:r>
+    </w:p>
+    <w:p>
+      <w:pPr>
+        <w:spacing w:after="80" w:lineRule="auto" w:line="300"/>
+        <w:ind w:left="360"/>
+      </w:pPr>
+      <w:r>
+        <w:rPr>
+          <w:rFonts w:ascii="Calibri" w:hAnsi="Calibri"/>
+          <w:b w:val="0"/>
+          <w:i w:val="0"/>
+          <w:color w:val="222222"/>
+          <w:sz w:val="22"/>
+        </w:rPr>
+        <w:t>Verify the change in the browser or app.</w:t>
+      </w:r>
+    </w:p>
+    <w:p>
+      <w:pPr>
+        <w:spacing w:after="80" w:lineRule="auto" w:line="300"/>
+        <w:ind w:left="360"/>
+      </w:pPr>
+      <w:r>
+        <w:rPr>
+          <w:rFonts w:ascii="Calibri" w:hAnsi="Calibri"/>
+          <w:b w:val="0"/>
+          <w:i w:val="0"/>
+          <w:color w:val="222222"/>
+          <w:sz w:val="22"/>
+        </w:rPr>
+        <w:t>Session End before push.</w:t>
+      </w:r>
+    </w:p>
+    <w:tbl>
+      <w:tblPr>
+        <w:tblW w:type="auto" w:w="0"/>
+        <w:tblLook w:firstColumn="1" w:firstRow="1" w:lastColumn="0" w:lastRow="0" w:noHBand="0" w:noVBand="1" w:val="04A0"/>
+      </w:tblPr>
+      <w:tblGrid>
+        <w:gridCol w:w="9360"/>
+      </w:tblGrid>
+      <w:tr>
+        <w:tc>
+          <w:tcPr>
+            <w:tcW w:type="dxa" w:w="9360"/>
+            <w:shd w:fill="0A0A0A" w:val="clear"/>
+            <w:tcBorders>
+              <w:top w:val="single" w:sz="4" w:color="1A1A1A"/>
+              <w:left w:val="single" w:sz="4" w:color="1A1A1A"/>
+              <w:bottom w:val="single" w:sz="4" w:color="1A1A1A"/>
+              <w:right w:val="single" w:sz="4" w:color="1A1A1A"/>
+            </w:tcBorders>
+          </w:tcPr>
+          <w:p>
+            <w:pPr>
+              <w:spacing w:before="160" w:after="160"/>
+            </w:pPr>
+            <w:r>
+              <w:rPr>
+                <w:rFonts w:ascii="Consolas" w:hAnsi="Consolas"/>
+                <w:b w:val="0"/>
+                <w:i w:val="0"/>
+                <w:color w:val="F0F0F0"/>
+                <w:sz w:val="20"/>
+              </w:rPr>
+              <w:t>git add .</w:t>
+              <w:br/>
+              <w:t>git commit -m "Week2 Day4: second development task - [brief description]"</w:t>
+              <w:br/>
+              <w:t>git push</w:t>
+            </w:r>
+          </w:p>
+        </w:tc>
+      </w:tr>
+    </w:tbl>
+    <w:p>
+      <w:pPr>
+        <w:spacing w:after="120"/>
+      </w:pPr>
+    </w:p>
+    <w:p>
+      <w:pPr>
+        <w:spacing w:before="240" w:after="120"/>
+      </w:pPr>
+      <w:r>
+        <w:rPr>
+          <w:rFonts w:ascii="Calibri" w:hAnsi="Calibri"/>
+          <w:b/>
+          <w:i w:val="0"/>
+          <w:color w:val="080808"/>
+          <w:sz w:val="23"/>
+        </w:rPr>
+        <w:t>Step 3. Update WEEK2_LOG.md</w:t>
+      </w:r>
+    </w:p>
+    <w:p>
+      <w:pPr>
+        <w:spacing w:after="80" w:lineRule="auto" w:line="300"/>
+        <w:ind w:left="360"/>
+      </w:pPr>
+      <w:r>
+        <w:rPr>
+          <w:rFonts w:ascii="Calibri" w:hAnsi="Calibri"/>
+          <w:b w:val="0"/>
+          <w:i w:val="0"/>
+          <w:color w:val="222222"/>
+          <w:sz w:val="22"/>
+        </w:rPr>
+        <w:t>Record what you changed and whether it is working.</w:t>
+      </w:r>
+    </w:p>
+    <w:p>
+      <w:pPr>
+        <w:spacing w:before="0" w:after="0"/>
+      </w:pPr>
+      <w:r>
+        <w:br w:type="page"/>
+      </w:r>
+    </w:p>
+    <w:p>
+      <w:pPr>
+        <w:spacing w:before="320" w:after="160"/>
+      </w:pPr>
+      <w:r>
+        <w:rPr>
+          <w:rFonts w:ascii="Arial" w:hAnsi="Arial"/>
+          <w:b/>
+          <w:i w:val="0"/>
+          <w:color w:val="080808"/>
+          <w:sz w:val="28"/>
+        </w:rPr>
+        <w:t>Week 2, Friday — Third Deliverable and Summary</w:t>
+      </w:r>
+    </w:p>
+    <w:p>
+      <w:pPr>
+        <w:spacing w:after="200" w:lineRule="auto" w:line="300"/>
+      </w:pPr>
+      <w:r>
+        <w:rPr>
+          <w:rFonts w:ascii="Calibri" w:hAnsi="Calibri"/>
+          <w:b w:val="0"/>
+          <w:i w:val="0"/>
+          <w:color w:val="222222"/>
+          <w:sz w:val="22"/>
+        </w:rPr>
+        <w:t>Objective: Complete a third small improvement and submit your two-week onboarding summary.</w:t>
+      </w:r>
+    </w:p>
+    <w:p>
+      <w:pPr>
+        <w:spacing w:before="240" w:after="120"/>
+      </w:pPr>
+      <w:r>
+        <w:rPr>
+          <w:rFonts w:ascii="Calibri" w:hAnsi="Calibri"/>
+          <w:b/>
+          <w:i w:val="0"/>
+          <w:color w:val="080808"/>
+          <w:sz w:val="23"/>
+        </w:rPr>
+        <w:t>Step 1. Pull latest</w:t>
+      </w:r>
+    </w:p>
+    <w:p>
+      <w:pPr>
+        <w:spacing w:before="120" w:after="40"/>
+        <w:ind w:left="360"/>
+      </w:pPr>
+      <w:r>
+        <w:rPr>
+          <w:rFonts w:ascii="Calibri" w:hAnsi="Calibri"/>
+          <w:b w:val="0"/>
+          <w:i/>
+          <w:color w:val="9A9A9A"/>
+          <w:sz w:val="20"/>
+        </w:rPr>
+        <w:t>Copy this line, paste into PowerShell, press Enter:</w:t>
+      </w:r>
+    </w:p>
+    <w:tbl>
+      <w:tblPr>
+        <w:tblW w:type="auto" w:w="0"/>
+        <w:tblLook w:firstColumn="1" w:firstRow="1" w:lastColumn="0" w:lastRow="0" w:noHBand="0" w:noVBand="1" w:val="04A0"/>
+      </w:tblPr>
+      <w:tblGrid>
+        <w:gridCol w:w="9360"/>
+      </w:tblGrid>
+      <w:tr>
+        <w:tc>
+          <w:tcPr>
+            <w:tcW w:type="dxa" w:w="9360"/>
+            <w:shd w:fill="0A0A0A" w:val="clear"/>
+            <w:tcBorders>
+              <w:top w:val="single" w:sz="4" w:color="1A1A1A"/>
+              <w:left w:val="single" w:sz="4" w:color="1A1A1A"/>
+              <w:bottom w:val="single" w:sz="4" w:color="1A1A1A"/>
+              <w:right w:val="single" w:sz="4" w:color="1A1A1A"/>
+            </w:tcBorders>
+          </w:tcPr>
+          <w:p>
+            <w:pPr>
+              <w:spacing w:before="160" w:after="160"/>
+            </w:pPr>
+            <w:r>
+              <w:rPr>
+                <w:rFonts w:ascii="Consolas" w:hAnsi="Consolas"/>
+                <w:b w:val="0"/>
+                <w:i w:val="0"/>
+                <w:color w:val="F0F0F0"/>
+                <w:sz w:val="20"/>
+              </w:rPr>
+              <w:t>git pull</w:t>
+            </w:r>
+          </w:p>
+        </w:tc>
+      </w:tr>
+    </w:tbl>
+    <w:p>
+      <w:pPr>
+        <w:spacing w:after="120"/>
+        <w:ind w:left="360"/>
+      </w:pPr>
+    </w:p>
+    <w:p>
+      <w:pPr>
+        <w:spacing w:before="80" w:after="200"/>
+        <w:ind w:left="360"/>
+      </w:pPr>
+      <w:r>
+        <w:rPr>
+          <w:rFonts w:ascii="Calibri" w:hAnsi="Calibri"/>
+          <w:b/>
+          <w:i w:val="0"/>
+          <w:color w:val="3DD68C"/>
+          <w:sz w:val="21"/>
+        </w:rPr>
+        <w:t xml:space="preserve">You should see: </w:t>
+      </w:r>
+      <w:r>
+        <w:rPr>
+          <w:rFonts w:ascii="Calibri" w:hAnsi="Calibri"/>
+          <w:b w:val="0"/>
+          <w:i w:val="0"/>
+          <w:color w:val="222222"/>
+          <w:sz w:val="21"/>
+        </w:rPr>
+        <w:t>Success</w:t>
+      </w:r>
+    </w:p>
+    <w:p>
+      <w:pPr>
+        <w:spacing w:before="240" w:after="120"/>
+      </w:pPr>
+      <w:r>
+        <w:rPr>
+          <w:rFonts w:ascii="Calibri" w:hAnsi="Calibri"/>
+          <w:b/>
+          <w:i w:val="0"/>
+          <w:color w:val="080808"/>
+          <w:sz w:val="23"/>
+        </w:rPr>
+        <w:t>Step 2. Third improvement</w:t>
+      </w:r>
+    </w:p>
+    <w:p>
+      <w:pPr>
+        <w:spacing w:after="80" w:lineRule="auto" w:line="300"/>
+        <w:ind w:left="360"/>
+      </w:pPr>
+      <w:r>
+        <w:rPr>
+          <w:rFonts w:ascii="Calibri" w:hAnsi="Calibri"/>
+          <w:b w:val="0"/>
+          <w:i w:val="0"/>
+          <w:color w:val="222222"/>
+          <w:sz w:val="22"/>
+        </w:rPr>
+        <w:t>Address gap #3, or refine one of this week's changes.</w:t>
+      </w:r>
+    </w:p>
+    <w:p>
+      <w:pPr>
+        <w:spacing w:after="80" w:lineRule="auto" w:line="300"/>
+        <w:ind w:left="360"/>
+      </w:pPr>
+      <w:r>
+        <w:rPr>
+          <w:rFonts w:ascii="Calibri" w:hAnsi="Calibri"/>
+          <w:b w:val="0"/>
+          <w:i w:val="0"/>
+          <w:color w:val="222222"/>
+          <w:sz w:val="22"/>
+        </w:rPr>
+        <w:t>Confirm UStud still runs locally.</w:t>
+      </w:r>
+    </w:p>
+    <w:p>
+      <w:pPr>
+        <w:spacing w:before="240" w:after="120"/>
+      </w:pPr>
+      <w:r>
+        <w:rPr>
+          <w:rFonts w:ascii="Calibri" w:hAnsi="Calibri"/>
+          <w:b/>
+          <w:i w:val="0"/>
+          <w:color w:val="080808"/>
+          <w:sz w:val="23"/>
+        </w:rPr>
+        <w:t>Step 3. Write two-week summary</w:t>
+      </w:r>
+    </w:p>
+    <w:p>
+      <w:pPr>
+        <w:spacing w:after="80" w:lineRule="auto" w:line="300"/>
+        <w:ind w:left="360"/>
+      </w:pPr>
+      <w:r>
+        <w:rPr>
+          <w:rFonts w:ascii="Calibri" w:hAnsi="Calibri"/>
+          <w:b w:val="0"/>
+          <w:i w:val="0"/>
+          <w:color w:val="222222"/>
+          <w:sz w:val="22"/>
+        </w:rPr>
+        <w:t>In progress/DAILY_LOG.md, add a summary entry covering:</w:t>
+      </w:r>
+    </w:p>
+    <w:p>
+      <w:pPr>
+        <w:spacing w:after="80" w:lineRule="auto" w:line="300"/>
+        <w:ind w:left="360"/>
+      </w:pPr>
+      <w:r>
+        <w:rPr>
+          <w:rFonts w:ascii="Calibri" w:hAnsi="Calibri"/>
+          <w:b w:val="0"/>
+          <w:i w:val="0"/>
+          <w:color w:val="222222"/>
+          <w:sz w:val="22"/>
+        </w:rPr>
+        <w:t>What you built in Week 2</w:t>
+      </w:r>
+    </w:p>
+    <w:p>
+      <w:pPr>
+        <w:spacing w:after="80" w:lineRule="auto" w:line="300"/>
+        <w:ind w:left="360"/>
+      </w:pPr>
+      <w:r>
+        <w:rPr>
+          <w:rFonts w:ascii="Calibri" w:hAnsi="Calibri"/>
+          <w:b w:val="0"/>
+          <w:i w:val="0"/>
+          <w:color w:val="222222"/>
+          <w:sz w:val="22"/>
+        </w:rPr>
+        <w:t>What remains blocked or unclear</w:t>
+      </w:r>
+    </w:p>
+    <w:p>
+      <w:pPr>
+        <w:spacing w:after="80" w:lineRule="auto" w:line="300"/>
+        <w:ind w:left="360"/>
+      </w:pPr>
+      <w:r>
+        <w:rPr>
+          <w:rFonts w:ascii="Calibri" w:hAnsi="Calibri"/>
+          <w:b w:val="0"/>
+          <w:i w:val="0"/>
+          <w:color w:val="222222"/>
+          <w:sz w:val="22"/>
+        </w:rPr>
+        <w:t>Your recommended focus for Week 3</w:t>
+      </w:r>
+    </w:p>
+    <w:p>
+      <w:pPr>
+        <w:spacing w:after="80" w:lineRule="auto" w:line="300"/>
+        <w:ind w:left="360"/>
+      </w:pPr>
+      <w:r>
+        <w:rPr>
+          <w:rFonts w:ascii="Calibri" w:hAnsi="Calibri"/>
+          <w:b w:val="0"/>
+          <w:i w:val="0"/>
+          <w:color w:val="222222"/>
+          <w:sz w:val="22"/>
+        </w:rPr>
+        <w:t>Complete Friday section in WEEK2_LOG.md.</w:t>
+      </w:r>
+    </w:p>
+    <w:p>
+      <w:pPr>
+        <w:spacing w:after="80" w:lineRule="auto" w:line="300"/>
+        <w:ind w:left="360"/>
+      </w:pPr>
+      <w:r>
+        <w:rPr>
+          <w:rFonts w:ascii="Calibri" w:hAnsi="Calibri"/>
+          <w:b w:val="0"/>
+          <w:i w:val="0"/>
+          <w:color w:val="222222"/>
+          <w:sz w:val="22"/>
+        </w:rPr>
+        <w:t>Session End, then push.</w:t>
+      </w:r>
+    </w:p>
+    <w:tbl>
+      <w:tblPr>
+        <w:tblW w:type="auto" w:w="0"/>
+        <w:tblLook w:firstColumn="1" w:firstRow="1" w:lastColumn="0" w:lastRow="0" w:noHBand="0" w:noVBand="1" w:val="04A0"/>
+      </w:tblPr>
+      <w:tblGrid>
+        <w:gridCol w:w="9360"/>
+      </w:tblGrid>
+      <w:tr>
+        <w:tc>
+          <w:tcPr>
+            <w:tcW w:type="dxa" w:w="9360"/>
+            <w:shd w:fill="0A0A0A" w:val="clear"/>
+            <w:tcBorders>
+              <w:top w:val="single" w:sz="4" w:color="1A1A1A"/>
+              <w:left w:val="single" w:sz="4" w:color="1A1A1A"/>
+              <w:bottom w:val="single" w:sz="4" w:color="1A1A1A"/>
+              <w:right w:val="single" w:sz="4" w:color="1A1A1A"/>
+            </w:tcBorders>
+          </w:tcPr>
+          <w:p>
+            <w:pPr>
+              <w:spacing w:before="160" w:after="160"/>
+            </w:pPr>
+            <w:r>
+              <w:rPr>
+                <w:rFonts w:ascii="Consolas" w:hAnsi="Consolas"/>
+                <w:b w:val="0"/>
+                <w:i w:val="0"/>
+                <w:color w:val="F0F0F0"/>
+                <w:sz w:val="20"/>
+              </w:rPr>
+              <w:t>git add .</w:t>
+              <w:br/>
+              <w:t>git commit -m "Week2 Day5: third deliverable and onboarding summary"</w:t>
+              <w:br/>
+              <w:t>git push</w:t>
+            </w:r>
+          </w:p>
+        </w:tc>
+      </w:tr>
+    </w:tbl>
+    <w:p>
+      <w:pPr>
+        <w:spacing w:after="120"/>
+      </w:pPr>
+    </w:p>
+    <w:tbl>
+      <w:tblPr>
+        <w:tblW w:type="auto" w:w="0"/>
+        <w:tblLook w:firstColumn="1" w:firstRow="1" w:lastColumn="0" w:lastRow="0" w:noHBand="0" w:noVBand="1" w:val="04A0"/>
+      </w:tblPr>
+      <w:tblGrid>
+        <w:gridCol w:w="9360"/>
+      </w:tblGrid>
+      <w:tr>
+        <w:tc>
+          <w:tcPr>
+            <w:tcW w:type="dxa" w:w="9360"/>
+            <w:shd w:fill="E8F8EF" w:val="clear"/>
+            <w:tcBorders>
+              <w:top w:val="single" w:sz="4" w:color="CCCCCC"/>
+              <w:left w:val="single" w:sz="4" w:color="CCCCCC"/>
+              <w:bottom w:val="single" w:sz="4" w:color="CCCCCC"/>
+              <w:right w:val="single" w:sz="4" w:color="CCCCCC"/>
+            </w:tcBorders>
+          </w:tcPr>
+          <w:p>
+            <w:pPr>
+              <w:spacing w:before="160" w:after="160"/>
+            </w:pPr>
+            <w:r>
+              <w:rPr>
+                <w:rFonts w:ascii="Consolas" w:hAnsi="Consolas"/>
+                <w:b/>
+                <w:i w:val="0"/>
+                <w:color w:val="3DD68C"/>
+                <w:sz w:val="17"/>
+              </w:rPr>
+              <w:t xml:space="preserve">END OF WEEK 2  </w:t>
+            </w:r>
+            <w:r>
+              <w:rPr>
+                <w:rFonts w:ascii="Calibri" w:hAnsi="Calibri"/>
+                <w:b w:val="0"/>
+                <w:i w:val="0"/>
+                <w:color w:val="222222"/>
+                <w:sz w:val="21"/>
+              </w:rPr>
+              <w:t>Review Part 11 completion criteria with management. Ongoing daily work follows cursor/EMPLOYEE_ONBOARDING.md in the repo.</w:t>
+            </w:r>
+          </w:p>
+        </w:tc>
+      </w:tr>
+    </w:tbl>
+    <w:p>
+      <w:pPr>
+        <w:spacing w:after="160"/>
+      </w:pPr>
+    </w:p>
+    <w:p>
+      <w:pPr>
+        <w:spacing w:before="0" w:after="0"/>
+      </w:pPr>
+      <w:r>
+        <w:br w:type="page"/>
+      </w:r>
+    </w:p>
+    <w:p>
+      <w:pPr>
+        <w:spacing w:after="160"/>
+      </w:pPr>
+    </w:p>
+    <w:p>
+      <w:pPr>
+        <w:spacing w:before="120" w:after="80"/>
+      </w:pPr>
+      <w:r>
+        <w:rPr>
+          <w:rFonts w:ascii="Consolas" w:hAnsi="Consolas"/>
+          <w:b/>
+          <w:i w:val="0"/>
+          <w:color w:val="4A9EFF"/>
+          <w:sz w:val="20"/>
+        </w:rPr>
+        <w:t>PART 9</w:t>
+      </w:r>
+    </w:p>
+    <w:p>
+      <w:pPr>
+        <w:spacing w:after="80"/>
+      </w:pPr>
+    </w:p>
+    <w:p>
+      <w:pPr>
+        <w:spacing w:after="120"/>
+      </w:pPr>
+      <w:r>
+        <w:rPr>
+          <w:rFonts w:ascii="Arial" w:hAnsi="Arial"/>
+          <w:b/>
+          <w:i w:val="0"/>
+          <w:color w:val="080808"/>
+          <w:sz w:val="40"/>
+        </w:rPr>
+        <w:t>Learning Resources</w:t>
+      </w:r>
+    </w:p>
+    <w:p>
+      <w:pPr>
+        <w:spacing w:after="280"/>
+      </w:pPr>
+      <w:r>
+        <w:rPr>
+          <w:rFonts w:ascii="Calibri" w:hAnsi="Calibri"/>
+          <w:b w:val="0"/>
+          <w:i w:val="0"/>
+          <w:color w:val="555555"/>
+          <w:sz w:val="22"/>
+        </w:rPr>
+        <w:t>Hyperlinks for courses and reference material.</w:t>
+      </w:r>
+    </w:p>
+    <w:p>
+      <w:pPr>
+        <w:spacing w:after="120"/>
+        <w:ind w:left="216"/>
+      </w:pPr>
+      <w:r>
+        <w:rPr>
+          <w:rFonts w:ascii="Calibri" w:hAnsi="Calibri"/>
+          <w:b/>
+          <w:i w:val="0"/>
+          <w:color w:val="222222"/>
+          <w:sz w:val="22"/>
+        </w:rPr>
+        <w:t>• Team project on GitHub</w:t>
+      </w:r>
+      <w:r>
+        <w:rPr>
+          <w:rFonts w:ascii="Calibri" w:hAnsi="Calibri"/>
+          <w:b w:val="0"/>
+          <w:i w:val="0"/>
+          <w:color w:val="9A9A9A"/>
+          <w:sz w:val="20"/>
+        </w:rPr>
+        <w:t xml:space="preserve">  (Always)  </w:t>
+      </w:r>
+      <w:hyperlink r:id="rId16">
+        <w:r>
+          <w:rPr>
+            <w:color w:val="4A9EFF"/>
+            <w:u w:val="single"/>
+          </w:rPr>
+          <w:t>https://github.com/axiom-forhumanity/ustud</w:t>
+        </w:r>
+      </w:hyperlink>
+    </w:p>
+    <w:p>
+      <w:pPr>
+        <w:spacing w:after="120"/>
+        <w:ind w:left="216"/>
+      </w:pPr>
+      <w:r>
+        <w:rPr>
+          <w:rFonts w:ascii="Calibri" w:hAnsi="Calibri"/>
+          <w:b/>
+          <w:i w:val="0"/>
+          <w:color w:val="222222"/>
+          <w:sz w:val="22"/>
+        </w:rPr>
+        <w:t>• Project brief</w:t>
+      </w:r>
+      <w:r>
+        <w:rPr>
+          <w:rFonts w:ascii="Calibri" w:hAnsi="Calibri"/>
+          <w:b w:val="0"/>
+          <w:i w:val="0"/>
+          <w:color w:val="9A9A9A"/>
+          <w:sz w:val="20"/>
+        </w:rPr>
+        <w:t xml:space="preserve">  (Week 2)  </w:t>
+      </w:r>
+      <w:hyperlink r:id="rId22">
+        <w:r>
+          <w:rPr>
+            <w:color w:val="4A9EFF"/>
+            <w:u w:val="single"/>
+          </w:rPr>
+          <w:t>https://github.com/axiom-forhumanity/ustud/blob/main/docs/PROJECT_BRIEF.md</w:t>
+        </w:r>
+      </w:hyperlink>
+    </w:p>
+    <w:p>
+      <w:pPr>
+        <w:spacing w:after="120"/>
+        <w:ind w:left="216"/>
+      </w:pPr>
+      <w:r>
+        <w:rPr>
+          <w:rFonts w:ascii="Calibri" w:hAnsi="Calibri"/>
+          <w:b/>
+          <w:i w:val="0"/>
+          <w:color w:val="222222"/>
+          <w:sz w:val="22"/>
+        </w:rPr>
+        <w:t>• AXIOM vision</w:t>
+      </w:r>
+      <w:r>
+        <w:rPr>
+          <w:rFonts w:ascii="Calibri" w:hAnsi="Calibri"/>
+          <w:b w:val="0"/>
+          <w:i w:val="0"/>
+          <w:color w:val="9A9A9A"/>
+          <w:sz w:val="20"/>
+        </w:rPr>
+        <w:t xml:space="preserve">  (Week 2)  </w:t>
+      </w:r>
+      <w:hyperlink r:id="rId23">
+        <w:r>
+          <w:rPr>
+            <w:color w:val="4A9EFF"/>
+            <w:u w:val="single"/>
+          </w:rPr>
+          <w:t>https://github.com/axiom-forhumanity/ustud/blob/main/docs/AXIOM_VISION.md</w:t>
+        </w:r>
+      </w:hyperlink>
+    </w:p>
+    <w:p>
+      <w:pPr>
+        <w:spacing w:after="120"/>
+        <w:ind w:left="216"/>
+      </w:pPr>
+      <w:r>
+        <w:rPr>
+          <w:rFonts w:ascii="Calibri" w:hAnsi="Calibri"/>
+          <w:b/>
+          <w:i w:val="0"/>
+          <w:color w:val="222222"/>
+          <w:sz w:val="22"/>
+        </w:rPr>
+        <w:t>• GitHub Hello World</w:t>
+      </w:r>
+      <w:r>
+        <w:rPr>
+          <w:rFonts w:ascii="Calibri" w:hAnsi="Calibri"/>
+          <w:b w:val="0"/>
+          <w:i w:val="0"/>
+          <w:color w:val="9A9A9A"/>
+          <w:sz w:val="20"/>
+        </w:rPr>
+        <w:t xml:space="preserve">  (Week 1 Mon)  </w:t>
+      </w:r>
+      <w:hyperlink r:id="rId18">
+        <w:r>
+          <w:rPr>
+            <w:color w:val="4A9EFF"/>
+            <w:u w:val="single"/>
+          </w:rPr>
+          <w:t>https://docs.github.com/en/get-started/start-your-journey/hello-world</w:t>
+        </w:r>
+      </w:hyperlink>
+    </w:p>
+    <w:p>
+      <w:pPr>
+        <w:spacing w:after="120"/>
+        <w:ind w:left="216"/>
+      </w:pPr>
+      <w:r>
+        <w:rPr>
+          <w:rFonts w:ascii="Calibri" w:hAnsi="Calibri"/>
+          <w:b/>
+          <w:i w:val="0"/>
+          <w:color w:val="222222"/>
+          <w:sz w:val="22"/>
+        </w:rPr>
+        <w:t>• GitHub Actions intro</w:t>
+      </w:r>
+      <w:r>
+        <w:rPr>
+          <w:rFonts w:ascii="Calibri" w:hAnsi="Calibri"/>
+          <w:b w:val="0"/>
+          <w:i w:val="0"/>
+          <w:color w:val="9A9A9A"/>
+          <w:sz w:val="20"/>
+        </w:rPr>
+        <w:t xml:space="preserve">  (Week 1 Tue)  </w:t>
+      </w:r>
+      <w:hyperlink r:id="rId19">
+        <w:r>
+          <w:rPr>
+            <w:color w:val="4A9EFF"/>
+            <w:u w:val="single"/>
+          </w:rPr>
+          <w:t>https://docs.github.com/en/actions/quickstart</w:t>
+        </w:r>
+      </w:hyperlink>
+    </w:p>
+    <w:p>
+      <w:pPr>
+        <w:spacing w:after="120"/>
+        <w:ind w:left="216"/>
+      </w:pPr>
+      <w:r>
+        <w:rPr>
+          <w:rFonts w:ascii="Calibri" w:hAnsi="Calibri"/>
+          <w:b/>
+          <w:i w:val="0"/>
+          <w:color w:val="222222"/>
+          <w:sz w:val="22"/>
+        </w:rPr>
+        <w:t>• NVIDIA free courses</w:t>
+      </w:r>
+      <w:r>
+        <w:rPr>
+          <w:rFonts w:ascii="Calibri" w:hAnsi="Calibri"/>
+          <w:b w:val="0"/>
+          <w:i w:val="0"/>
+          <w:color w:val="9A9A9A"/>
+          <w:sz w:val="20"/>
+        </w:rPr>
+        <w:t xml:space="preserve">  (Week 1 Wed–Thu, Week 2 Wed)  </w:t>
+      </w:r>
+      <w:hyperlink r:id="rId20">
+        <w:r>
+          <w:rPr>
+            <w:color w:val="4A9EFF"/>
+            <w:u w:val="single"/>
+          </w:rPr>
+          <w:t>https://www.nvidia.com/en-us/training/self-paced-courses/</w:t>
+        </w:r>
+      </w:hyperlink>
+    </w:p>
+    <w:p>
+      <w:pPr>
+        <w:spacing w:after="120"/>
+        <w:ind w:left="216"/>
+      </w:pPr>
+      <w:r>
+        <w:rPr>
+          <w:rFonts w:ascii="Calibri" w:hAnsi="Calibri"/>
+          <w:b/>
+          <w:i w:val="0"/>
+          <w:color w:val="222222"/>
+          <w:sz w:val="22"/>
+        </w:rPr>
+        <w:t>• Cursor introduction</w:t>
+      </w:r>
+      <w:r>
+        <w:rPr>
+          <w:rFonts w:ascii="Calibri" w:hAnsi="Calibri"/>
+          <w:b w:val="0"/>
+          <w:i w:val="0"/>
+          <w:color w:val="9A9A9A"/>
+          <w:sz w:val="20"/>
+        </w:rPr>
+        <w:t xml:space="preserve">  (Week 1 Thu)  </w:t>
+      </w:r>
+      <w:hyperlink r:id="rId21">
+        <w:r>
+          <w:rPr>
+            <w:color w:val="4A9EFF"/>
+            <w:u w:val="single"/>
+          </w:rPr>
+          <w:t>https://docs.cursor.com/get-started/introduction</w:t>
+        </w:r>
+      </w:hyperlink>
+    </w:p>
+    <w:p>
+      <w:pPr>
+        <w:spacing w:after="120"/>
+        <w:ind w:left="216"/>
+      </w:pPr>
+      <w:r>
+        <w:rPr>
+          <w:rFonts w:ascii="Calibri" w:hAnsi="Calibri"/>
+          <w:b/>
+          <w:i w:val="0"/>
+          <w:color w:val="222222"/>
+          <w:sz w:val="22"/>
+        </w:rPr>
+        <w:t>• Cursor Agent mode</w:t>
+      </w:r>
+      <w:r>
+        <w:rPr>
+          <w:rFonts w:ascii="Calibri" w:hAnsi="Calibri"/>
+          <w:b w:val="0"/>
+          <w:i w:val="0"/>
+          <w:color w:val="9A9A9A"/>
+          <w:sz w:val="20"/>
+        </w:rPr>
+        <w:t xml:space="preserve">  (Week 2)  </w:t>
+      </w:r>
+      <w:hyperlink r:id="rId24">
+        <w:r>
+          <w:rPr>
+            <w:color w:val="4A9EFF"/>
+            <w:u w:val="single"/>
+          </w:rPr>
+          <w:t>https://docs.cursor.com/chat/agent</w:t>
+        </w:r>
+      </w:hyperlink>
+    </w:p>
+    <w:p>
+      <w:pPr>
+        <w:spacing w:after="120"/>
+        <w:ind w:left="216"/>
+      </w:pPr>
+      <w:r>
+        <w:rPr>
+          <w:rFonts w:ascii="Calibri" w:hAnsi="Calibri"/>
+          <w:b/>
+          <w:i w:val="0"/>
+          <w:color w:val="222222"/>
+          <w:sz w:val="22"/>
+        </w:rPr>
+        <w:t>• Git basics book</w:t>
+      </w:r>
+      <w:r>
+        <w:rPr>
+          <w:rFonts w:ascii="Calibri" w:hAnsi="Calibri"/>
+          <w:b w:val="0"/>
+          <w:i w:val="0"/>
+          <w:color w:val="9A9A9A"/>
+          <w:sz w:val="20"/>
+        </w:rPr>
+        <w:t xml:space="preserve">  (Reference)  </w:t>
+      </w:r>
+      <w:hyperlink r:id="rId25">
+        <w:r>
+          <w:rPr>
+            <w:color w:val="4A9EFF"/>
+            <w:u w:val="single"/>
+          </w:rPr>
+          <w:t>https://git-scm.com/book/en/v2/Getting-Started-About-Version-Control</w:t>
+        </w:r>
+      </w:hyperlink>
+    </w:p>
+    <w:p>
+      <w:pPr>
+        <w:spacing w:after="200" w:lineRule="auto" w:line="300"/>
+      </w:pPr>
+      <w:r>
+        <w:rPr>
+          <w:rFonts w:ascii="Calibri" w:hAnsi="Calibri"/>
+          <w:b w:val="0"/>
+          <w:i w:val="0"/>
+          <w:color w:val="222222"/>
+          <w:sz w:val="22"/>
+        </w:rPr>
+        <w:t>Save NVIDIA course certificates as screenshots in your Week 1 upload folder if provided.</w:t>
+      </w:r>
+    </w:p>
+    <w:p>
+      <w:pPr>
+        <w:spacing w:before="0" w:after="0"/>
+      </w:pPr>
+      <w:r>
+        <w:br w:type="page"/>
+      </w:r>
+    </w:p>
+    <w:p>
+      <w:pPr>
+        <w:spacing w:after="160"/>
+      </w:pPr>
+    </w:p>
+    <w:p>
+      <w:pPr>
+        <w:spacing w:before="120" w:after="80"/>
+      </w:pPr>
+      <w:r>
+        <w:rPr>
+          <w:rFonts w:ascii="Consolas" w:hAnsi="Consolas"/>
+          <w:b/>
+          <w:i w:val="0"/>
+          <w:color w:val="4A9EFF"/>
+          <w:sz w:val="20"/>
+        </w:rPr>
+        <w:t>PART 10</w:t>
+      </w:r>
+    </w:p>
+    <w:p>
+      <w:pPr>
+        <w:spacing w:after="80"/>
+      </w:pPr>
+    </w:p>
+    <w:p>
+      <w:pPr>
+        <w:spacing w:after="120"/>
+      </w:pPr>
+      <w:r>
+        <w:rPr>
+          <w:rFonts w:ascii="Arial" w:hAnsi="Arial"/>
+          <w:b/>
+          <w:i w:val="0"/>
+          <w:color w:val="080808"/>
+          <w:sz w:val="40"/>
+        </w:rPr>
+        <w:t>Support and Troubleshooting</w:t>
+      </w:r>
+    </w:p>
+    <w:p>
+      <w:pPr>
+        <w:spacing w:after="280"/>
+      </w:pPr>
+      <w:r>
+        <w:rPr>
+          <w:rFonts w:ascii="Calibri" w:hAnsi="Calibri"/>
+          <w:b w:val="0"/>
+          <w:i w:val="0"/>
+          <w:color w:val="555555"/>
+          <w:sz w:val="22"/>
+        </w:rPr>
+        <w:t>Common issues and resolution steps.</w:t>
+      </w:r>
+    </w:p>
+    <w:p>
+      <w:pPr>
+        <w:spacing w:before="320" w:after="160"/>
+      </w:pPr>
+      <w:r>
+        <w:rPr>
+          <w:rFonts w:ascii="Arial" w:hAnsi="Arial"/>
+          <w:b/>
+          <w:i w:val="0"/>
+          <w:color w:val="080808"/>
+          <w:sz w:val="28"/>
+        </w:rPr>
+        <w:t>Push failed: Permission denied (403)</w:t>
+      </w:r>
+    </w:p>
+    <w:p>
+      <w:pPr>
+        <w:spacing w:after="200" w:lineRule="auto" w:line="300"/>
+      </w:pPr>
+      <w:r>
+        <w:rPr>
+          <w:rFonts w:ascii="Calibri" w:hAnsi="Calibri"/>
+          <w:b w:val="0"/>
+          <w:i w:val="0"/>
+          <w:color w:val="222222"/>
+          <w:sz w:val="22"/>
+        </w:rPr>
+        <w:t>You are logged into the wrong GitHub account.</w:t>
+      </w:r>
+    </w:p>
+    <w:p>
+      <w:pPr>
+        <w:spacing w:before="240" w:after="120"/>
+      </w:pPr>
+      <w:r>
+        <w:rPr>
+          <w:rFonts w:ascii="Calibri" w:hAnsi="Calibri"/>
+          <w:b/>
+          <w:i w:val="0"/>
+          <w:color w:val="080808"/>
+          <w:sz w:val="23"/>
+        </w:rPr>
+        <w:t>Step 1. Install GitHub CLI</w:t>
+      </w:r>
+    </w:p>
+    <w:p>
+      <w:pPr>
+        <w:spacing w:after="80" w:lineRule="auto" w:line="300"/>
+        <w:ind w:left="360"/>
+      </w:pPr>
+      <w:r>
+        <w:rPr>
+          <w:rFonts w:ascii="Calibri" w:hAnsi="Calibri"/>
+          <w:b w:val="0"/>
+          <w:i w:val="0"/>
+          <w:color w:val="222222"/>
+          <w:sz w:val="22"/>
+        </w:rPr>
         <w:t>Download from:</w:t>
       </w:r>
     </w:p>
     <w:p>
-      <w:hyperlink r:id="rId22">
+      <w:hyperlink r:id="rId26">
         <w:r>
           <w:rPr>
             <w:color w:val="4A9EFF"/>
@@ -7043,7 +9559,7 @@
           <w:color w:val="080808"/>
           <w:sz w:val="28"/>
         </w:rPr>
-        <w:t>Something else is broken</w:t>
+        <w:t>Other issues</w:t>
       </w:r>
     </w:p>
     <w:p>
@@ -7063,6 +9579,14 @@
     </w:p>
     <w:p>
       <w:pPr>
+        <w:spacing w:before="0" w:after="0"/>
+      </w:pPr>
+      <w:r>
+        <w:br w:type="page"/>
+      </w:r>
+    </w:p>
+    <w:p>
+      <w:pPr>
         <w:spacing w:after="160"/>
       </w:pPr>
     </w:p>
@@ -7078,7 +9602,7 @@
           <w:color w:val="4A9EFF"/>
           <w:sz w:val="20"/>
         </w:rPr>
-        <w:t>PART 9</w:t>
+        <w:t>PART 11</w:t>
       </w:r>
     </w:p>
     <w:p>
@@ -7098,7 +9622,7 @@
           <w:color w:val="080808"/>
           <w:sz w:val="40"/>
         </w:rPr>
-        <w:t>Free Learning Links</w:t>
+        <w:t>Onboarding Completion Criteria</w:t>
       </w:r>
     </w:p>
     <w:p>
@@ -7113,247 +9637,123 @@
           <w:color w:val="555555"/>
           <w:sz w:val="22"/>
         </w:rPr>
-        <w:t>Click to open. Save NVIDIA certificates as screenshots if you earn them.</w:t>
+        <w:t>Confirm each item with management at the end of Week 2.</w:t>
+      </w:r>
+    </w:p>
+    <w:p>
+      <w:pPr>
+        <w:spacing w:before="320" w:after="160"/>
+      </w:pPr>
+      <w:r>
+        <w:rPr>
+          <w:rFonts w:ascii="Arial" w:hAnsi="Arial"/>
+          <w:b/>
+          <w:i w:val="0"/>
+          <w:color w:val="080808"/>
+          <w:sz w:val="28"/>
+        </w:rPr>
+        <w:t>Week 1 — Foundation</w:t>
       </w:r>
     </w:p>
     <w:p>
       <w:pPr>
         <w:spacing w:after="120"/>
-        <w:ind w:left="216"/>
-      </w:pPr>
-      <w:r>
-        <w:rPr>
-          <w:rFonts w:ascii="Calibri" w:hAnsi="Calibri"/>
-          <w:b/>
+        <w:ind w:left="288"/>
+      </w:pPr>
+      <w:r>
+        <w:rPr>
+          <w:rFonts w:ascii="Calibri" w:hAnsi="Calibri"/>
+          <w:b w:val="0"/>
           <w:i w:val="0"/>
           <w:color w:val="222222"/>
           <w:sz w:val="22"/>
         </w:rPr>
-        <w:t>• Team project on GitHub</w:t>
-      </w:r>
+        <w:t>[ ]  Git pull, git add, git commit, and git push completed without assistance</w:t>
+      </w:r>
+    </w:p>
+    <w:p>
+      <w:pPr>
+        <w:spacing w:after="120"/>
+        <w:ind w:left="288"/>
+      </w:pPr>
       <w:r>
         <w:rPr>
           <w:rFonts w:ascii="Calibri" w:hAnsi="Calibri"/>
           <w:b w:val="0"/>
-          <w:i w:val="0"/>
-          <w:color w:val="9A9A9A"/>
-          <w:sz w:val="20"/>
-        </w:rPr>
-        <w:t xml:space="preserve">  (Always)  </w:t>
-      </w:r>
-      <w:hyperlink r:id="rId16">
-        <w:r>
-          <w:rPr>
-            <w:color w:val="4A9EFF"/>
-            <w:u w:val="single"/>
-          </w:rPr>
-          <w:t>https://github.com/axiom-forhumanity/ustud</w:t>
-        </w:r>
-      </w:hyperlink>
-    </w:p>
-    <w:p>
-      <w:pPr>
-        <w:spacing w:after="120"/>
-        <w:ind w:left="216"/>
-      </w:pPr>
-      <w:r>
-        <w:rPr>
-          <w:rFonts w:ascii="Calibri" w:hAnsi="Calibri"/>
-          <w:b/>
           <w:i w:val="0"/>
           <w:color w:val="222222"/>
           <w:sz w:val="22"/>
         </w:rPr>
-        <w:t>• GitHub Hello World</w:t>
-      </w:r>
+        <w:t>[ ]  Session recordings uploaded each weekday during Week 1</w:t>
+      </w:r>
+    </w:p>
+    <w:p>
+      <w:pPr>
+        <w:spacing w:after="120"/>
+        <w:ind w:left="288"/>
+      </w:pPr>
       <w:r>
         <w:rPr>
           <w:rFonts w:ascii="Calibri" w:hAnsi="Calibri"/>
           <w:b w:val="0"/>
-          <w:i w:val="0"/>
-          <w:color w:val="9A9A9A"/>
-          <w:sz w:val="20"/>
-        </w:rPr>
-        <w:t xml:space="preserve">  (Monday)  </w:t>
-      </w:r>
-      <w:hyperlink r:id="rId18">
-        <w:r>
-          <w:rPr>
-            <w:color w:val="4A9EFF"/>
-            <w:u w:val="single"/>
-          </w:rPr>
-          <w:t>https://docs.github.com/en/get-started/start-your-journey/hello-world</w:t>
-        </w:r>
-      </w:hyperlink>
-    </w:p>
-    <w:p>
-      <w:pPr>
-        <w:spacing w:after="120"/>
-        <w:ind w:left="216"/>
-      </w:pPr>
-      <w:r>
-        <w:rPr>
-          <w:rFonts w:ascii="Calibri" w:hAnsi="Calibri"/>
-          <w:b/>
           <w:i w:val="0"/>
           <w:color w:val="222222"/>
           <w:sz w:val="22"/>
         </w:rPr>
-        <w:t>• GitHub Actions intro</w:t>
-      </w:r>
+        <w:t>[ ]  UStud runs locally at http://localhost:5173</w:t>
+      </w:r>
+    </w:p>
+    <w:p>
+      <w:pPr>
+        <w:spacing w:after="120"/>
+        <w:ind w:left="288"/>
+      </w:pPr>
       <w:r>
         <w:rPr>
           <w:rFonts w:ascii="Calibri" w:hAnsi="Calibri"/>
           <w:b w:val="0"/>
-          <w:i w:val="0"/>
-          <w:color w:val="9A9A9A"/>
-          <w:sz w:val="20"/>
-        </w:rPr>
-        <w:t xml:space="preserve">  (Tuesday)  </w:t>
-      </w:r>
-      <w:hyperlink r:id="rId19">
-        <w:r>
-          <w:rPr>
-            <w:color w:val="4A9EFF"/>
-            <w:u w:val="single"/>
-          </w:rPr>
-          <w:t>https://docs.github.com/en/actions/quickstart</w:t>
-        </w:r>
-      </w:hyperlink>
-    </w:p>
-    <w:p>
-      <w:pPr>
-        <w:spacing w:after="120"/>
-        <w:ind w:left="216"/>
-      </w:pPr>
-      <w:r>
-        <w:rPr>
-          <w:rFonts w:ascii="Calibri" w:hAnsi="Calibri"/>
-          <w:b/>
           <w:i w:val="0"/>
           <w:color w:val="222222"/>
           <w:sz w:val="22"/>
         </w:rPr>
-        <w:t>• NVIDIA free courses</w:t>
-      </w:r>
+        <w:t>[ ]  progress/CURRENT_STATE.md lists three product gaps</w:t>
+      </w:r>
+    </w:p>
+    <w:p>
+      <w:pPr>
+        <w:spacing w:after="120"/>
+        <w:ind w:left="288"/>
+      </w:pPr>
       <w:r>
         <w:rPr>
           <w:rFonts w:ascii="Calibri" w:hAnsi="Calibri"/>
           <w:b w:val="0"/>
-          <w:i w:val="0"/>
-          <w:color w:val="9A9A9A"/>
-          <w:sz w:val="20"/>
-        </w:rPr>
-        <w:t xml:space="preserve">  (Wed–Thu)  </w:t>
-      </w:r>
-      <w:hyperlink r:id="rId20">
-        <w:r>
-          <w:rPr>
-            <w:color w:val="4A9EFF"/>
-            <w:u w:val="single"/>
-          </w:rPr>
-          <w:t>https://www.nvidia.com/en-us/training/self-paced-courses/</w:t>
-        </w:r>
-      </w:hyperlink>
-    </w:p>
-    <w:p>
-      <w:pPr>
-        <w:spacing w:after="120"/>
-        <w:ind w:left="216"/>
-      </w:pPr>
-      <w:r>
-        <w:rPr>
-          <w:rFonts w:ascii="Calibri" w:hAnsi="Calibri"/>
-          <w:b/>
           <w:i w:val="0"/>
           <w:color w:val="222222"/>
           <w:sz w:val="22"/>
         </w:rPr>
-        <w:t>• Cursor introduction</w:t>
-      </w:r>
+        <w:t>[ ]  At least one small improvement pushed to GitHub</w:t>
+      </w:r>
+    </w:p>
+    <w:p>
+      <w:pPr>
+        <w:spacing w:after="120"/>
+        <w:ind w:left="288"/>
+      </w:pPr>
       <w:r>
         <w:rPr>
           <w:rFonts w:ascii="Calibri" w:hAnsi="Calibri"/>
           <w:b w:val="0"/>
-          <w:i w:val="0"/>
-          <w:color w:val="9A9A9A"/>
-          <w:sz w:val="20"/>
-        </w:rPr>
-        <w:t xml:space="preserve">  (Thursday)  </w:t>
-      </w:r>
-      <w:hyperlink r:id="rId21">
-        <w:r>
-          <w:rPr>
-            <w:color w:val="4A9EFF"/>
-            <w:u w:val="single"/>
-          </w:rPr>
-          <w:t>https://docs.cursor.com/get-started/introduction</w:t>
-        </w:r>
-      </w:hyperlink>
-    </w:p>
-    <w:p>
-      <w:pPr>
-        <w:spacing w:after="120"/>
-        <w:ind w:left="216"/>
-      </w:pPr>
-      <w:r>
-        <w:rPr>
-          <w:rFonts w:ascii="Calibri" w:hAnsi="Calibri"/>
-          <w:b/>
           <w:i w:val="0"/>
           <w:color w:val="222222"/>
           <w:sz w:val="22"/>
         </w:rPr>
-        <w:t>• Git basics book</w:t>
-      </w:r>
-      <w:r>
-        <w:rPr>
-          <w:rFonts w:ascii="Calibri" w:hAnsi="Calibri"/>
-          <w:b w:val="0"/>
-          <w:i w:val="0"/>
-          <w:color w:val="9A9A9A"/>
-          <w:sz w:val="20"/>
-        </w:rPr>
-        <w:t xml:space="preserve">  (Anytime)  </w:t>
-      </w:r>
-      <w:hyperlink r:id="rId23">
-        <w:r>
-          <w:rPr>
-            <w:color w:val="4A9EFF"/>
-            <w:u w:val="single"/>
-          </w:rPr>
-          <w:t>https://git-scm.com/book/en/v2/Getting-Started-About-Version-Control</w:t>
-        </w:r>
-      </w:hyperlink>
-    </w:p>
-    <w:p>
-      <w:pPr>
-        <w:spacing w:after="160"/>
-      </w:pPr>
-    </w:p>
-    <w:p>
-      <w:pPr>
-        <w:spacing w:before="120" w:after="80"/>
-      </w:pPr>
-      <w:r>
-        <w:rPr>
-          <w:rFonts w:ascii="Consolas" w:hAnsi="Consolas"/>
-          <w:b/>
-          <w:i w:val="0"/>
-          <w:color w:val="4A9EFF"/>
-          <w:sz w:val="20"/>
-        </w:rPr>
-        <w:t>PART 10</w:t>
-      </w:r>
-    </w:p>
-    <w:p>
-      <w:pPr>
-        <w:spacing w:after="80"/>
-      </w:pPr>
-    </w:p>
-    <w:p>
-      <w:pPr>
-        <w:spacing w:after="120"/>
+        <w:t>[ ]  Session Start and Session End used in Cursor</w:t>
+      </w:r>
+    </w:p>
+    <w:p>
+      <w:pPr>
+        <w:spacing w:before="320" w:after="160"/>
       </w:pPr>
       <w:r>
         <w:rPr>
@@ -7361,24 +9761,9 @@
           <w:b/>
           <w:i w:val="0"/>
           <w:color w:val="080808"/>
-          <w:sz w:val="40"/>
-        </w:rPr>
-        <w:t>Week 1 Complete — Graduation Checklist</w:t>
-      </w:r>
-    </w:p>
-    <w:p>
-      <w:pPr>
-        <w:spacing w:after="280"/>
-      </w:pPr>
-      <w:r>
-        <w:rPr>
-          <w:rFonts w:ascii="Calibri" w:hAnsi="Calibri"/>
-          <w:b w:val="0"/>
-          <w:i w:val="0"/>
-          <w:color w:val="555555"/>
-          <w:sz w:val="22"/>
-        </w:rPr>
-        <w:t>When every box is checked, you are ready for regular work.</w:t>
+          <w:sz w:val="28"/>
+        </w:rPr>
+        <w:t>Week 2 — Development</w:t>
       </w:r>
     </w:p>
     <w:p>
@@ -7394,7 +9779,7 @@
           <w:color w:val="222222"/>
           <w:sz w:val="22"/>
         </w:rPr>
-        <w:t>[ ]  I can open PowerShell and run git pull, git add ., git commit, git push without help</w:t>
+        <w:t>[ ]  Three development tasks pushed to GitHub (Tue, Thu, Fri minimum)</w:t>
       </w:r>
     </w:p>
     <w:p>
@@ -7410,7 +9795,7 @@
           <w:color w:val="222222"/>
           <w:sz w:val="22"/>
         </w:rPr>
-        <w:t>[ ]  I uploaded screen recordings every day Monday through Friday</w:t>
+        <w:t>[ ]  progress/WEEK2_LOG.md completed for all five weekdays</w:t>
       </w:r>
     </w:p>
     <w:p>
@@ -7426,7 +9811,7 @@
           <w:color w:val="222222"/>
           <w:sz w:val="22"/>
         </w:rPr>
-        <w:t>[ ]  UStud opens in my browser at http://localhost:5173</w:t>
+        <w:t>[ ]  progress/DAILY_LOG.md includes a two-week summary entry</w:t>
       </w:r>
     </w:p>
     <w:p>
@@ -7442,7 +9827,7 @@
           <w:color w:val="222222"/>
           <w:sz w:val="22"/>
         </w:rPr>
-        <w:t>[ ]  progress/CURRENT_STATE.md lists the top 3 product gaps</w:t>
+        <w:t>[ ]  Offline tutor tested and results documented</w:t>
       </w:r>
     </w:p>
     <w:p>
@@ -7458,13 +9843,17 @@
           <w:color w:val="222222"/>
           <w:sz w:val="22"/>
         </w:rPr>
-        <w:t>[ ]  I pushed at least one small improvement to GitHub</w:t>
-      </w:r>
-    </w:p>
-    <w:p>
-      <w:pPr>
-        <w:spacing w:after="120"/>
-        <w:ind w:left="288"/>
+        <w:t>[ ]  Daily Session Start / Session End workflow followed without prompts</w:t>
+      </w:r>
+    </w:p>
+    <w:p>
+      <w:pPr>
+        <w:spacing w:after="240"/>
+      </w:pPr>
+    </w:p>
+    <w:p>
+      <w:pPr>
+        <w:spacing w:after="200" w:lineRule="auto" w:line="300"/>
       </w:pPr>
       <w:r>
         <w:rPr>
@@ -7474,13 +9863,8 @@
           <w:color w:val="222222"/>
           <w:sz w:val="22"/>
         </w:rPr>
-        <w:t>[ ]  I used Session Start and Session End in Cursor</w:t>
-      </w:r>
-    </w:p>
-    <w:p>
-      <w:pPr>
-        <w:spacing w:after="240"/>
-      </w:pPr>
+        <w:t>After onboarding, your daily operating guide is cursor/EMPLOYEE_ONBOARDING.md in the repo.</w:t>
+      </w:r>
     </w:p>
     <w:p>
       <w:pPr>
@@ -7494,22 +9878,7 @@
           <w:color w:val="222222"/>
           <w:sz w:val="22"/>
         </w:rPr>
-        <w:t>After graduation, your daily guide is cursor/EMPLOYEE_ONBOARDING.md in the repo.</w:t>
-      </w:r>
-    </w:p>
-    <w:p>
-      <w:pPr>
-        <w:spacing w:after="200" w:lineRule="auto" w:line="300"/>
-      </w:pPr>
-      <w:r>
-        <w:rPr>
-          <w:rFonts w:ascii="Calibri" w:hAnsi="Calibri"/>
-          <w:b w:val="0"/>
-          <w:i w:val="0"/>
-          <w:color w:val="222222"/>
-          <w:sz w:val="22"/>
-        </w:rPr>
-        <w:t>Questions: progress/BLOCKERS.md or email management.</w:t>
+        <w:t>Questions and blockers: progress/BLOCKERS.md or contact management directly.</w:t>
       </w:r>
     </w:p>
     <w:p>

</xml_diff>

<commit_message>
Restore Day 1 learning link in onboarding doc.
Co-authored-by: Cursor <cursoragent@cursor.com>
</commit_message>
<xml_diff>
--- a/cursor/onboarding/AXIOM_EMPLOYEE_ONBOARDING.docx
+++ b/cursor/onboarding/AXIOM_EMPLOYEE_ONBOARDING.docx
@@ -4295,6 +4295,41 @@
     </w:p>
     <w:p>
       <w:pPr>
+        <w:spacing w:after="120"/>
+        <w:ind w:left="216"/>
+      </w:pPr>
+      <w:r>
+        <w:rPr>
+          <w:rFonts w:ascii="Calibri" w:hAnsi="Calibri"/>
+          <w:b/>
+          <w:i w:val="0"/>
+          <w:color w:val="222222"/>
+          <w:sz w:val="22"/>
+        </w:rPr>
+        <w:t>• GitHub Hello World</w:t>
+      </w:r>
+      <w:r>
+        <w:rPr>
+          <w:rFonts w:ascii="Calibri" w:hAnsi="Calibri"/>
+          <w:b w:val="0"/>
+          <w:i w:val="0"/>
+          <w:color w:val="9A9A9A"/>
+          <w:sz w:val="20"/>
+        </w:rPr>
+        <w:t xml:space="preserve">  (Optional ~30 min)  </w:t>
+      </w:r>
+      <w:hyperlink r:id="rId18">
+        <w:r>
+          <w:rPr>
+            <w:color w:val="4A9EFF"/>
+            <w:u w:val="single"/>
+          </w:rPr>
+          <w:t>https://docs.github.com/en/get-started/start-your-journey/hello-world</w:t>
+        </w:r>
+      </w:hyperlink>
+    </w:p>
+    <w:p>
+      <w:pPr>
         <w:spacing w:before="0" w:after="0"/>
       </w:pPr>
       <w:r>
@@ -5358,7 +5393,7 @@
         </w:rPr>
         <w:t xml:space="preserve">  (Optional ~20 min)  </w:t>
       </w:r>
-      <w:hyperlink r:id="rId18">
+      <w:hyperlink r:id="rId19">
         <w:r>
           <w:rPr>
             <w:color w:val="4A9EFF"/>
@@ -5568,7 +5603,7 @@
       </w:r>
     </w:p>
     <w:p>
-      <w:hyperlink r:id="rId19">
+      <w:hyperlink r:id="rId20">
         <w:r>
           <w:rPr>
             <w:color w:val="4A9EFF"/>
@@ -6204,7 +6239,7 @@
         </w:rPr>
         <w:t xml:space="preserve">  (Required)  </w:t>
       </w:r>
-      <w:hyperlink r:id="rId19">
+      <w:hyperlink r:id="rId20">
         <w:r>
           <w:rPr>
             <w:color w:val="4A9EFF"/>
@@ -7139,7 +7174,7 @@
         </w:rPr>
         <w:t xml:space="preserve">  (Optional ~20 min)  </w:t>
       </w:r>
-      <w:hyperlink r:id="rId20">
+      <w:hyperlink r:id="rId21">
         <w:r>
           <w:rPr>
             <w:color w:val="4A9EFF"/>
@@ -10388,7 +10423,7 @@
       </w:r>
     </w:p>
     <w:p>
-      <w:hyperlink r:id="rId19">
+      <w:hyperlink r:id="rId20">
         <w:r>
           <w:rPr>
             <w:color w:val="4A9EFF"/>
@@ -13023,7 +13058,7 @@
         </w:rPr>
         <w:t xml:space="preserve">  (Day 6+)  </w:t>
       </w:r>
-      <w:hyperlink r:id="rId21">
+      <w:hyperlink r:id="rId22">
         <w:r>
           <w:rPr>
             <w:color w:val="4A9EFF"/>
@@ -13058,7 +13093,7 @@
         </w:rPr>
         <w:t xml:space="preserve">  (Day 6+)  </w:t>
       </w:r>
-      <w:hyperlink r:id="rId22">
+      <w:hyperlink r:id="rId23">
         <w:r>
           <w:rPr>
             <w:color w:val="4A9EFF"/>
@@ -13093,7 +13128,7 @@
         </w:rPr>
         <w:t xml:space="preserve">  (Day 1)  </w:t>
       </w:r>
-      <w:hyperlink r:id="rId23">
+      <w:hyperlink r:id="rId18">
         <w:r>
           <w:rPr>
             <w:color w:val="4A9EFF"/>
@@ -13128,7 +13163,7 @@
         </w:rPr>
         <w:t xml:space="preserve">  (Day 2)  </w:t>
       </w:r>
-      <w:hyperlink r:id="rId18">
+      <w:hyperlink r:id="rId19">
         <w:r>
           <w:rPr>
             <w:color w:val="4A9EFF"/>
@@ -13163,7 +13198,7 @@
         </w:rPr>
         <w:t xml:space="preserve">  (Day 3, 4, 8)  </w:t>
       </w:r>
-      <w:hyperlink r:id="rId19">
+      <w:hyperlink r:id="rId20">
         <w:r>
           <w:rPr>
             <w:color w:val="4A9EFF"/>
@@ -13198,7 +13233,7 @@
         </w:rPr>
         <w:t xml:space="preserve">  (Day 3)  </w:t>
       </w:r>
-      <w:hyperlink r:id="rId19">
+      <w:hyperlink r:id="rId20">
         <w:r>
           <w:rPr>
             <w:color w:val="4A9EFF"/>
@@ -13233,7 +13268,7 @@
         </w:rPr>
         <w:t xml:space="preserve">  (Day 4, 8)  </w:t>
       </w:r>
-      <w:hyperlink r:id="rId19">
+      <w:hyperlink r:id="rId20">
         <w:r>
           <w:rPr>
             <w:color w:val="4A9EFF"/>
@@ -13268,7 +13303,7 @@
         </w:rPr>
         <w:t xml:space="preserve">  (Day 4)  </w:t>
       </w:r>
-      <w:hyperlink r:id="rId20">
+      <w:hyperlink r:id="rId21">
         <w:r>
           <w:rPr>
             <w:color w:val="4A9EFF"/>

</xml_diff>

<commit_message>
Add AXIOM-styled USTUD project brief one-pager.
Single-page Word doc with vision, MVP goals, foundation objectives, and success criteria. Linked from onboarding README.

Co-authored-by: Cursor <cursoragent@cursor.com>
</commit_message>
<xml_diff>
--- a/cursor/onboarding/AXIOM_EMPLOYEE_ONBOARDING.docx
+++ b/cursor/onboarding/AXIOM_EMPLOYEE_ONBOARDING.docx
@@ -13046,7 +13046,7 @@
           <w:color w:val="222222"/>
           <w:sz w:val="22"/>
         </w:rPr>
-        <w:t>• Project brief</w:t>
+        <w:t>• USTUD project one-pager</w:t>
       </w:r>
       <w:r>
         <w:rPr>
@@ -13059,6 +13059,41 @@
         <w:t xml:space="preserve">  (Day 6+)  </w:t>
       </w:r>
       <w:hyperlink r:id="rId22">
+        <w:r>
+          <w:rPr>
+            <w:color w:val="4A9EFF"/>
+            <w:u w:val="single"/>
+          </w:rPr>
+          <w:t>https://github.com/axiom-forhumanity/ustud/blob/main/docs/USTUD_PROJECT_BRIEF_ONE_PAGER.docx</w:t>
+        </w:r>
+      </w:hyperlink>
+    </w:p>
+    <w:p>
+      <w:pPr>
+        <w:spacing w:after="120"/>
+        <w:ind w:left="216"/>
+      </w:pPr>
+      <w:r>
+        <w:rPr>
+          <w:rFonts w:ascii="Calibri" w:hAnsi="Calibri"/>
+          <w:b/>
+          <w:i w:val="0"/>
+          <w:color w:val="222222"/>
+          <w:sz w:val="22"/>
+        </w:rPr>
+        <w:t>• Project brief</w:t>
+      </w:r>
+      <w:r>
+        <w:rPr>
+          <w:rFonts w:ascii="Calibri" w:hAnsi="Calibri"/>
+          <w:b w:val="0"/>
+          <w:i w:val="0"/>
+          <w:color w:val="9A9A9A"/>
+          <w:sz w:val="20"/>
+        </w:rPr>
+        <w:t xml:space="preserve">  (Day 6+)  </w:t>
+      </w:r>
+      <w:hyperlink r:id="rId23">
         <w:r>
           <w:rPr>
             <w:color w:val="4A9EFF"/>
@@ -13093,7 +13128,7 @@
         </w:rPr>
         <w:t xml:space="preserve">  (Day 6+)  </w:t>
       </w:r>
-      <w:hyperlink r:id="rId23">
+      <w:hyperlink r:id="rId24">
         <w:r>
           <w:rPr>
             <w:color w:val="4A9EFF"/>
@@ -13338,7 +13373,7 @@
         </w:rPr>
         <w:t xml:space="preserve">  (Day 6+)  </w:t>
       </w:r>
-      <w:hyperlink r:id="rId24">
+      <w:hyperlink r:id="rId25">
         <w:r>
           <w:rPr>
             <w:color w:val="4A9EFF"/>
@@ -13373,7 +13408,7 @@
         </w:rPr>
         <w:t xml:space="preserve">  (Reference)  </w:t>
       </w:r>
-      <w:hyperlink r:id="rId25">
+      <w:hyperlink r:id="rId26">
         <w:r>
           <w:rPr>
             <w:color w:val="4A9EFF"/>
@@ -13408,7 +13443,7 @@
         </w:rPr>
         <w:t xml:space="preserve">  (Appendix C if needed)  </w:t>
       </w:r>
-      <w:hyperlink r:id="rId26">
+      <w:hyperlink r:id="rId27">
         <w:r>
           <w:rPr>
             <w:color w:val="4A9EFF"/>
@@ -13527,7 +13562,7 @@
       </w:r>
     </w:p>
     <w:p>
-      <w:hyperlink r:id="rId26">
+      <w:hyperlink r:id="rId27">
         <w:r>
           <w:rPr>
             <w:color w:val="4A9EFF"/>

</xml_diff>